<commit_message>
Improve Word report layout and add PDF copy
Fix clipped figures (explicit auto line spacing), set fixed table
column widths, add a cover page with key results, and include a PDF
rendering of the report.

Co-Authored-By: Claude Opus 5.5 <noreply@anthropic.com>
Claude-Session: https://claude.ai/code/session_01A81w2dALBeqEqY4Wsg95DC
</commit_message>
<xml_diff>
--- a/nyc_taxi_fare_project/NYC_Taxi_Fare_Deliverable2_Report.docx
+++ b/nyc_taxi_fare_project/NYC_Taxi_Fare_Deliverable2_Report.docx
@@ -4,7 +4,7 @@
   <w:body>
     <w:p>
       <w:pPr>
-        <w:spacing w:after="120" w:before="0"/>
+        <w:spacing w:after="200" w:before="1200"/>
         <w:jc w:val="center"/>
       </w:pPr>
       <w:r>
@@ -13,8 +13,8 @@
           <w:b/>
           <w:bCs/>
           <w:color w:val="1F4E79"/>
-          <w:sz w:val="40"/>
-          <w:szCs w:val="40"/>
+          <w:sz w:val="52"/>
+          <w:szCs w:val="52"/>
         </w:rPr>
         <w:t xml:space="preserve">Upfront Fare Estimation for NYC Taxis</w:t>
       </w:r>
@@ -54,137 +54,327 @@
     </w:p>
     <w:p>
       <w:pPr>
-        <w:spacing w:after="40"/>
+        <w:spacing w:after="200" w:before="300"/>
+      </w:pPr>
+    </w:p>
+    <w:tbl>
+      <w:tblPr>
+        <w:tblW w:type="dxa" w:w="5400"/>
+        <w:jc w:val="center"/>
+        <w:tblBorders>
+          <w:top w:val="single" w:color="auto" w:sz="4"/>
+          <w:left w:val="single" w:color="auto" w:sz="4"/>
+          <w:bottom w:val="single" w:color="auto" w:sz="4"/>
+          <w:right w:val="single" w:color="auto" w:sz="4"/>
+          <w:insideH w:val="single" w:color="auto" w:sz="4"/>
+          <w:insideV w:val="single" w:color="auto" w:sz="4"/>
+        </w:tblBorders>
+      </w:tblPr>
+      <w:tblGrid>
+        <w:gridCol w:w="1800"/>
+        <w:gridCol w:w="3600"/>
+      </w:tblGrid>
+      <w:tr>
+        <w:tc>
+          <w:tcPr>
+            <w:tcW w:type="dxa" w:w="1800"/>
+            <w:tcBorders>
+              <w:top w:val="none" w:color="FFFFFF" w:sz="0"/>
+              <w:left w:val="none" w:color="FFFFFF" w:sz="0"/>
+              <w:bottom w:val="none" w:color="FFFFFF" w:sz="0"/>
+              <w:right w:val="none" w:color="FFFFFF" w:sz="0"/>
+            </w:tcBorders>
+            <w:tcMar>
+              <w:top w:type="dxa" w:w="60"/>
+              <w:left w:type="dxa" w:w="100"/>
+              <w:bottom w:type="dxa" w:w="60"/>
+              <w:right w:type="dxa" w:w="100"/>
+            </w:tcMar>
+          </w:tcPr>
+          <w:p>
+            <w:pPr>
+              <w:jc w:val="right"/>
+            </w:pPr>
+            <w:r>
+              <w:rPr>
+                <w:b/>
+                <w:bCs/>
+                <w:color w:val="1F4E79"/>
+              </w:rPr>
+              <w:t xml:space="preserve">Student</w:t>
+            </w:r>
+          </w:p>
+        </w:tc>
+        <w:tc>
+          <w:tcPr>
+            <w:tcW w:type="dxa" w:w="3600"/>
+            <w:tcBorders>
+              <w:top w:val="none" w:color="FFFFFF" w:sz="0"/>
+              <w:left w:val="none" w:color="FFFFFF" w:sz="0"/>
+              <w:bottom w:val="none" w:color="FFFFFF" w:sz="0"/>
+              <w:right w:val="none" w:color="FFFFFF" w:sz="0"/>
+            </w:tcBorders>
+            <w:tcMar>
+              <w:top w:type="dxa" w:w="60"/>
+              <w:left w:type="dxa" w:w="100"/>
+              <w:bottom w:type="dxa" w:w="60"/>
+              <w:right w:type="dxa" w:w="100"/>
+            </w:tcMar>
+          </w:tcPr>
+          <w:p>
+            <w:r>
+              <w:rPr>
+                <w:color w:val="404040"/>
+              </w:rPr>
+              <w:t xml:space="preserve">[Your Name]</w:t>
+            </w:r>
+          </w:p>
+        </w:tc>
+      </w:tr>
+      <w:tr>
+        <w:tc>
+          <w:tcPr>
+            <w:tcW w:type="dxa" w:w="1800"/>
+            <w:tcBorders>
+              <w:top w:val="none" w:color="FFFFFF" w:sz="0"/>
+              <w:left w:val="none" w:color="FFFFFF" w:sz="0"/>
+              <w:bottom w:val="none" w:color="FFFFFF" w:sz="0"/>
+              <w:right w:val="none" w:color="FFFFFF" w:sz="0"/>
+            </w:tcBorders>
+            <w:tcMar>
+              <w:top w:type="dxa" w:w="60"/>
+              <w:left w:type="dxa" w:w="100"/>
+              <w:bottom w:type="dxa" w:w="60"/>
+              <w:right w:type="dxa" w:w="100"/>
+            </w:tcMar>
+          </w:tcPr>
+          <w:p>
+            <w:pPr>
+              <w:jc w:val="right"/>
+            </w:pPr>
+            <w:r>
+              <w:rPr>
+                <w:b/>
+                <w:bCs/>
+                <w:color w:val="1F4E79"/>
+              </w:rPr>
+              <w:t xml:space="preserve">Student ID</w:t>
+            </w:r>
+          </w:p>
+        </w:tc>
+        <w:tc>
+          <w:tcPr>
+            <w:tcW w:type="dxa" w:w="3600"/>
+            <w:tcBorders>
+              <w:top w:val="none" w:color="FFFFFF" w:sz="0"/>
+              <w:left w:val="none" w:color="FFFFFF" w:sz="0"/>
+              <w:bottom w:val="none" w:color="FFFFFF" w:sz="0"/>
+              <w:right w:val="none" w:color="FFFFFF" w:sz="0"/>
+            </w:tcBorders>
+            <w:tcMar>
+              <w:top w:type="dxa" w:w="60"/>
+              <w:left w:type="dxa" w:w="100"/>
+              <w:bottom w:type="dxa" w:w="60"/>
+              <w:right w:type="dxa" w:w="100"/>
+            </w:tcMar>
+          </w:tcPr>
+          <w:p>
+            <w:r>
+              <w:rPr>
+                <w:color w:val="404040"/>
+              </w:rPr>
+              <w:t xml:space="preserve">[ID]</w:t>
+            </w:r>
+          </w:p>
+        </w:tc>
+      </w:tr>
+      <w:tr>
+        <w:tc>
+          <w:tcPr>
+            <w:tcW w:type="dxa" w:w="1800"/>
+            <w:tcBorders>
+              <w:top w:val="none" w:color="FFFFFF" w:sz="0"/>
+              <w:left w:val="none" w:color="FFFFFF" w:sz="0"/>
+              <w:bottom w:val="none" w:color="FFFFFF" w:sz="0"/>
+              <w:right w:val="none" w:color="FFFFFF" w:sz="0"/>
+            </w:tcBorders>
+            <w:tcMar>
+              <w:top w:type="dxa" w:w="60"/>
+              <w:left w:type="dxa" w:w="100"/>
+              <w:bottom w:type="dxa" w:w="60"/>
+              <w:right w:type="dxa" w:w="100"/>
+            </w:tcMar>
+          </w:tcPr>
+          <w:p>
+            <w:pPr>
+              <w:jc w:val="right"/>
+            </w:pPr>
+            <w:r>
+              <w:rPr>
+                <w:b/>
+                <w:bCs/>
+                <w:color w:val="1F4E79"/>
+              </w:rPr>
+              <w:t xml:space="preserve">Course</w:t>
+            </w:r>
+          </w:p>
+        </w:tc>
+        <w:tc>
+          <w:tcPr>
+            <w:tcW w:type="dxa" w:w="3600"/>
+            <w:tcBorders>
+              <w:top w:val="none" w:color="FFFFFF" w:sz="0"/>
+              <w:left w:val="none" w:color="FFFFFF" w:sz="0"/>
+              <w:bottom w:val="none" w:color="FFFFFF" w:sz="0"/>
+              <w:right w:val="none" w:color="FFFFFF" w:sz="0"/>
+            </w:tcBorders>
+            <w:tcMar>
+              <w:top w:type="dxa" w:w="60"/>
+              <w:left w:type="dxa" w:w="100"/>
+              <w:bottom w:type="dxa" w:w="60"/>
+              <w:right w:type="dxa" w:w="100"/>
+            </w:tcMar>
+          </w:tcPr>
+          <w:p>
+            <w:r>
+              <w:rPr>
+                <w:color w:val="404040"/>
+              </w:rPr>
+              <w:t xml:space="preserve">[Course code and name]</w:t>
+            </w:r>
+          </w:p>
+        </w:tc>
+      </w:tr>
+      <w:tr>
+        <w:tc>
+          <w:tcPr>
+            <w:tcW w:type="dxa" w:w="1800"/>
+            <w:tcBorders>
+              <w:top w:val="none" w:color="FFFFFF" w:sz="0"/>
+              <w:left w:val="none" w:color="FFFFFF" w:sz="0"/>
+              <w:bottom w:val="none" w:color="FFFFFF" w:sz="0"/>
+              <w:right w:val="none" w:color="FFFFFF" w:sz="0"/>
+            </w:tcBorders>
+            <w:tcMar>
+              <w:top w:type="dxa" w:w="60"/>
+              <w:left w:type="dxa" w:w="100"/>
+              <w:bottom w:type="dxa" w:w="60"/>
+              <w:right w:type="dxa" w:w="100"/>
+            </w:tcMar>
+          </w:tcPr>
+          <w:p>
+            <w:pPr>
+              <w:jc w:val="right"/>
+            </w:pPr>
+            <w:r>
+              <w:rPr>
+                <w:b/>
+                <w:bCs/>
+                <w:color w:val="1F4E79"/>
+              </w:rPr>
+              <w:t xml:space="preserve">Instructor</w:t>
+            </w:r>
+          </w:p>
+        </w:tc>
+        <w:tc>
+          <w:tcPr>
+            <w:tcW w:type="dxa" w:w="3600"/>
+            <w:tcBorders>
+              <w:top w:val="none" w:color="FFFFFF" w:sz="0"/>
+              <w:left w:val="none" w:color="FFFFFF" w:sz="0"/>
+              <w:bottom w:val="none" w:color="FFFFFF" w:sz="0"/>
+              <w:right w:val="none" w:color="FFFFFF" w:sz="0"/>
+            </w:tcBorders>
+            <w:tcMar>
+              <w:top w:type="dxa" w:w="60"/>
+              <w:left w:type="dxa" w:w="100"/>
+              <w:bottom w:type="dxa" w:w="60"/>
+              <w:right w:type="dxa" w:w="100"/>
+            </w:tcMar>
+          </w:tcPr>
+          <w:p>
+            <w:r>
+              <w:rPr>
+                <w:color w:val="404040"/>
+              </w:rPr>
+              <w:t xml:space="preserve">[Instructor name]</w:t>
+            </w:r>
+          </w:p>
+        </w:tc>
+      </w:tr>
+      <w:tr>
+        <w:tc>
+          <w:tcPr>
+            <w:tcW w:type="dxa" w:w="1800"/>
+            <w:tcBorders>
+              <w:top w:val="none" w:color="FFFFFF" w:sz="0"/>
+              <w:left w:val="none" w:color="FFFFFF" w:sz="0"/>
+              <w:bottom w:val="none" w:color="FFFFFF" w:sz="0"/>
+              <w:right w:val="none" w:color="FFFFFF" w:sz="0"/>
+            </w:tcBorders>
+            <w:tcMar>
+              <w:top w:type="dxa" w:w="60"/>
+              <w:left w:type="dxa" w:w="100"/>
+              <w:bottom w:type="dxa" w:w="60"/>
+              <w:right w:type="dxa" w:w="100"/>
+            </w:tcMar>
+          </w:tcPr>
+          <w:p>
+            <w:pPr>
+              <w:jc w:val="right"/>
+            </w:pPr>
+            <w:r>
+              <w:rPr>
+                <w:b/>
+                <w:bCs/>
+                <w:color w:val="1F4E79"/>
+              </w:rPr>
+              <w:t xml:space="preserve">Date</w:t>
+            </w:r>
+          </w:p>
+        </w:tc>
+        <w:tc>
+          <w:tcPr>
+            <w:tcW w:type="dxa" w:w="3600"/>
+            <w:tcBorders>
+              <w:top w:val="none" w:color="FFFFFF" w:sz="0"/>
+              <w:left w:val="none" w:color="FFFFFF" w:sz="0"/>
+              <w:bottom w:val="none" w:color="FFFFFF" w:sz="0"/>
+              <w:right w:val="none" w:color="FFFFFF" w:sz="0"/>
+            </w:tcBorders>
+            <w:tcMar>
+              <w:top w:type="dxa" w:w="60"/>
+              <w:left w:type="dxa" w:w="100"/>
+              <w:bottom w:type="dxa" w:w="60"/>
+              <w:right w:type="dxa" w:w="100"/>
+            </w:tcMar>
+          </w:tcPr>
+          <w:p>
+            <w:r>
+              <w:rPr>
+                <w:color w:val="404040"/>
+              </w:rPr>
+              <w:t xml:space="preserve">September 2026</w:t>
+            </w:r>
+          </w:p>
+        </w:tc>
+      </w:tr>
+    </w:tbl>
+    <w:p>
+      <w:pPr>
+        <w:spacing w:after="160" w:before="600"/>
+        <w:jc w:val="center"/>
       </w:pPr>
       <w:r>
         <w:rPr>
           <w:b/>
           <w:bCs/>
-        </w:rPr>
-        <w:t xml:space="preserve">Dataset:</w:t>
-      </w:r>
-      <w:r>
-        <w:t xml:space="preserve"> NYC Taxi &amp; Limousine Commission (TLC) trip records, yellow and green taxis, March 2019 (6,433 trips; 6,348 after cleaning)</w:t>
-      </w:r>
-    </w:p>
-    <w:p>
-      <w:pPr>
-        <w:spacing w:after="40"/>
-      </w:pPr>
-      <w:r>
-        <w:rPr>
-          <w:b/>
-          <w:bCs/>
-        </w:rPr>
-        <w:t xml:space="preserve">Task:</w:t>
-      </w:r>
-      <w:r>
-        <w:t xml:space="preserve"> Regression. The model predicts the metered fare (USD) from information that is known at booking time.</w:t>
-      </w:r>
-    </w:p>
-    <w:p>
-      <w:pPr>
-        <w:spacing w:after="40"/>
-      </w:pPr>
-      <w:r>
-        <w:rPr>
-          <w:b/>
-          <w:bCs/>
-        </w:rPr>
-        <w:t xml:space="preserve">Code:</w:t>
-      </w:r>
-      <w:r>
-        <w:t xml:space="preserve"> </w:t>
-      </w:r>
-      <w:r>
-        <w:rPr>
-          <w:rFonts w:ascii="Consolas" w:cs="Consolas" w:eastAsia="Consolas" w:hAnsi="Consolas"/>
-          <w:sz w:val="19"/>
-          <w:szCs w:val="19"/>
-        </w:rPr>
-        <w:t xml:space="preserve">NYC_Taxi_Fare_Deliverable2.ipynb</w:t>
-      </w:r>
-      <w:r>
-        <w:t xml:space="preserve"> (pandas, NumPy, Matplotlib, Seaborn, scikit-learn; runs in Google Colab)</w:t>
-      </w:r>
-    </w:p>
-    <w:p>
-      <w:pPr>
-        <w:pBdr>
-          <w:left w:val="single" w:color="1F4E79" w:sz="24" w:space="8"/>
-        </w:pBdr>
-        <w:shd w:fill="EAF1F8" w:color="auto" w:val="clear"/>
-        <w:spacing w:after="200" w:before="120"/>
-        <w:ind w:left="200" w:right="200"/>
-      </w:pPr>
-      <w:r>
-        <w:rPr>
-          <w:b/>
-          <w:bCs/>
+          <w:color w:val="808080"/>
+          <w:spacing w:val="40"/>
           <w:sz w:val="20"/>
           <w:szCs w:val="20"/>
         </w:rPr>
-        <w:t xml:space="preserve">Problem recap (Deliverable 1).</w:t>
-      </w:r>
-      <w:r>
-        <w:rPr>
-          <w:sz w:val="20"/>
-          <w:szCs w:val="20"/>
-        </w:rPr>
-        <w:t xml:space="preserve"> App-based ride services quote a price before the trip starts. A NYC taxi fare is only known when the meter stops. Taxi fleets, e-hail apps and the TLC want an accurate </w:t>
-      </w:r>
-      <w:r>
-        <w:rPr>
-          <w:b/>
-          <w:bCs/>
-          <w:sz w:val="20"/>
-          <w:szCs w:val="20"/>
-        </w:rPr>
-        <w:t xml:space="preserve">upfront fare estimate</w:t>
-      </w:r>
-      <w:r>
-        <w:rPr>
-          <w:sz w:val="20"/>
-          <w:szCs w:val="20"/>
-        </w:rPr>
-        <w:t xml:space="preserve"> so that riders can budget and compare transport options. In Deliverable 1 we cleaned the data (98.7% of rows kept) and built features that are known at booking time: distance, hour and day, boroughs, frequent zones, airport and JFK flat-fare flags, taxi colour and party size. We deliberately left out the outcome fields tip, tolls, total, duration and dropoff time to prevent leakage. We also set baselines. The last week of March (25–31 March, 1,363 trips) is held out as a time-based test set. All tuning uses 5-fold cross-validation (CV) on the first 3½ weeks (4,985 trips).</w:t>
-      </w:r>
-    </w:p>
-    <w:p>
-      <w:pPr>
-        <w:pStyle w:val="Heading1"/>
-      </w:pPr>
-      <w:r>
-        <w:t xml:space="preserve">1. Hyperparameter Tuning</w:t>
-      </w:r>
-    </w:p>
-    <w:p>
-      <w:pPr>
-        <w:spacing w:after="140"/>
-      </w:pPr>
-      <w:r>
-        <w:t xml:space="preserve">We tuned three model families, each wrapped in a scikit-learn </w:t>
-      </w:r>
-      <w:r>
-        <w:rPr>
-          <w:rFonts w:ascii="Consolas" w:cs="Consolas" w:eastAsia="Consolas" w:hAnsi="Consolas"/>
-          <w:sz w:val="19"/>
-          <w:szCs w:val="19"/>
-        </w:rPr>
-        <w:t xml:space="preserve">Pipeline</w:t>
-      </w:r>
-      <w:r>
-        <w:t xml:space="preserve">. The preprocessing is the same across models: numeric features are standardised for Ridge only, and categorical features are one-hot encoded with zones seen fewer than 20 times grouped together. The optimisation metric is </w:t>
-      </w:r>
-      <w:r>
-        <w:rPr>
-          <w:b/>
-          <w:bCs/>
-        </w:rPr>
-        <w:t xml:space="preserve">mean absolute error (MAE, in dollars)</w:t>
-      </w:r>
-      <w:r>
-        <w:t xml:space="preserve">. MAE is the average amount by which a quote misses the fare, and a few extreme trips affect it less than they affect RMSE.</w:t>
+        <w:t xml:space="preserve">KEY RESULTS</w:t>
       </w:r>
     </w:p>
     <w:tbl>
@@ -200,21 +390,409 @@
         </w:tblBorders>
       </w:tblPr>
       <w:tblGrid>
-        <w:gridCol w:w="1476"/>
-        <w:gridCol w:w="1155"/>
-        <w:gridCol w:w="3403"/>
-        <w:gridCol w:w="808"/>
-        <w:gridCol w:w="898"/>
-        <w:gridCol w:w="808"/>
-        <w:gridCol w:w="812"/>
+        <w:gridCol w:w="2340"/>
+        <w:gridCol w:w="2340"/>
+        <w:gridCol w:w="2340"/>
+        <w:gridCol w:w="2340"/>
+      </w:tblGrid>
+      <w:tr>
+        <w:tc>
+          <w:tcPr>
+            <w:tcW w:type="dxa" w:w="2340"/>
+            <w:tcBorders>
+              <w:top w:val="single" w:color="FFFFFF" w:sz="24"/>
+              <w:left w:val="single" w:color="FFFFFF" w:sz="24"/>
+              <w:bottom w:val="single" w:color="FFFFFF" w:sz="24"/>
+              <w:right w:val="single" w:color="FFFFFF" w:sz="24"/>
+            </w:tcBorders>
+            <w:shd w:fill="EAF1F8" w:color="auto" w:val="clear"/>
+            <w:tcMar>
+              <w:top w:type="dxa" w:w="160"/>
+              <w:left w:type="dxa" w:w="120"/>
+              <w:bottom w:type="dxa" w:w="160"/>
+              <w:right w:type="dxa" w:w="120"/>
+            </w:tcMar>
+          </w:tcPr>
+          <w:p>
+            <w:pPr>
+              <w:jc w:val="center"/>
+            </w:pPr>
+            <w:r>
+              <w:rPr>
+                <w:b/>
+                <w:bCs/>
+                <w:color w:val="1F4E79"/>
+                <w:sz w:val="40"/>
+                <w:szCs w:val="40"/>
+              </w:rPr>
+              <w:t xml:space="preserve">$1.26</w:t>
+            </w:r>
+          </w:p>
+          <w:p>
+            <w:pPr>
+              <w:jc w:val="center"/>
+            </w:pPr>
+            <w:r>
+              <w:rPr>
+                <w:color w:val="404040"/>
+                <w:sz w:val="17"/>
+                <w:szCs w:val="17"/>
+              </w:rPr>
+              <w:t xml:space="preserve">average quote error (MAE)</w:t>
+            </w:r>
+          </w:p>
+        </w:tc>
+        <w:tc>
+          <w:tcPr>
+            <w:tcW w:type="dxa" w:w="2340"/>
+            <w:tcBorders>
+              <w:top w:val="single" w:color="FFFFFF" w:sz="24"/>
+              <w:left w:val="single" w:color="FFFFFF" w:sz="24"/>
+              <w:bottom w:val="single" w:color="FFFFFF" w:sz="24"/>
+              <w:right w:val="single" w:color="FFFFFF" w:sz="24"/>
+            </w:tcBorders>
+            <w:shd w:fill="EAF1F8" w:color="auto" w:val="clear"/>
+            <w:tcMar>
+              <w:top w:type="dxa" w:w="160"/>
+              <w:left w:type="dxa" w:w="120"/>
+              <w:bottom w:type="dxa" w:w="160"/>
+              <w:right w:type="dxa" w:w="120"/>
+            </w:tcMar>
+          </w:tcPr>
+          <w:p>
+            <w:pPr>
+              <w:jc w:val="center"/>
+            </w:pPr>
+            <w:r>
+              <w:rPr>
+                <w:b/>
+                <w:bCs/>
+                <w:color w:val="1F4E79"/>
+                <w:sz w:val="40"/>
+                <w:szCs w:val="40"/>
+              </w:rPr>
+              <w:t xml:space="preserve">0.951</w:t>
+            </w:r>
+          </w:p>
+          <w:p>
+            <w:pPr>
+              <w:jc w:val="center"/>
+            </w:pPr>
+            <w:r>
+              <w:rPr>
+                <w:color w:val="404040"/>
+                <w:sz w:val="17"/>
+                <w:szCs w:val="17"/>
+              </w:rPr>
+              <w:t xml:space="preserve">R² on unseen week</w:t>
+            </w:r>
+          </w:p>
+        </w:tc>
+        <w:tc>
+          <w:tcPr>
+            <w:tcW w:type="dxa" w:w="2340"/>
+            <w:tcBorders>
+              <w:top w:val="single" w:color="FFFFFF" w:sz="24"/>
+              <w:left w:val="single" w:color="FFFFFF" w:sz="24"/>
+              <w:bottom w:val="single" w:color="FFFFFF" w:sz="24"/>
+              <w:right w:val="single" w:color="FFFFFF" w:sz="24"/>
+            </w:tcBorders>
+            <w:shd w:fill="EAF1F8" w:color="auto" w:val="clear"/>
+            <w:tcMar>
+              <w:top w:type="dxa" w:w="160"/>
+              <w:left w:type="dxa" w:w="120"/>
+              <w:bottom w:type="dxa" w:w="160"/>
+              <w:right w:type="dxa" w:w="120"/>
+            </w:tcMar>
+          </w:tcPr>
+          <w:p>
+            <w:pPr>
+              <w:jc w:val="center"/>
+            </w:pPr>
+            <w:r>
+              <w:rPr>
+                <w:b/>
+                <w:bCs/>
+                <w:color w:val="1F4E79"/>
+                <w:sz w:val="40"/>
+                <w:szCs w:val="40"/>
+              </w:rPr>
+              <w:t xml:space="preserve">54%</w:t>
+            </w:r>
+          </w:p>
+          <w:p>
+            <w:pPr>
+              <w:jc w:val="center"/>
+            </w:pPr>
+            <w:r>
+              <w:rPr>
+                <w:color w:val="404040"/>
+                <w:sz w:val="17"/>
+                <w:szCs w:val="17"/>
+              </w:rPr>
+              <w:t xml:space="preserve">lower error than the TLC rate card</w:t>
+            </w:r>
+          </w:p>
+        </w:tc>
+        <w:tc>
+          <w:tcPr>
+            <w:tcW w:type="dxa" w:w="2340"/>
+            <w:tcBorders>
+              <w:top w:val="single" w:color="FFFFFF" w:sz="24"/>
+              <w:left w:val="single" w:color="FFFFFF" w:sz="24"/>
+              <w:bottom w:val="single" w:color="FFFFFF" w:sz="24"/>
+              <w:right w:val="single" w:color="FFFFFF" w:sz="24"/>
+            </w:tcBorders>
+            <w:shd w:fill="EAF1F8" w:color="auto" w:val="clear"/>
+            <w:tcMar>
+              <w:top w:type="dxa" w:w="160"/>
+              <w:left w:type="dxa" w:w="120"/>
+              <w:bottom w:type="dxa" w:w="160"/>
+              <w:right w:type="dxa" w:w="120"/>
+            </w:tcMar>
+          </w:tcPr>
+          <w:p>
+            <w:pPr>
+              <w:jc w:val="center"/>
+            </w:pPr>
+            <w:r>
+              <w:rPr>
+                <w:b/>
+                <w:bCs/>
+                <w:color w:val="1F4E79"/>
+                <w:sz w:val="40"/>
+                <w:szCs w:val="40"/>
+              </w:rPr>
+              <w:t xml:space="preserve">2.7%</w:t>
+            </w:r>
+          </w:p>
+          <w:p>
+            <w:pPr>
+              <w:jc w:val="center"/>
+            </w:pPr>
+            <w:r>
+              <w:rPr>
+                <w:color w:val="404040"/>
+                <w:sz w:val="17"/>
+                <w:szCs w:val="17"/>
+              </w:rPr>
+              <w:t xml:space="preserve">trips with &gt; $5 bill shock (vs 14.2%)</w:t>
+            </w:r>
+          </w:p>
+        </w:tc>
+      </w:tr>
+    </w:tbl>
+    <w:p>
+      <w:pPr>
+        <w:spacing w:before="400"/>
+      </w:pPr>
+    </w:p>
+    <w:p>
+      <w:pPr>
+        <w:spacing w:after="60"/>
+        <w:jc w:val="center"/>
+      </w:pPr>
+      <w:r>
+        <w:rPr>
+          <w:b/>
+          <w:bCs/>
+          <w:color w:val="404040"/>
+          <w:sz w:val="19"/>
+          <w:szCs w:val="19"/>
+        </w:rPr>
+        <w:t xml:space="preserve">Dataset:</w:t>
+      </w:r>
+      <w:r>
+        <w:rPr>
+          <w:color w:val="404040"/>
+          <w:sz w:val="19"/>
+          <w:szCs w:val="19"/>
+        </w:rPr>
+        <w:t xml:space="preserve"> NYC Taxi &amp; Limousine Commission (TLC) trip records, yellow and green taxis, March 2019 (6,433 trips; 6,348 after cleaning)</w:t>
+      </w:r>
+    </w:p>
+    <w:p>
+      <w:pPr>
+        <w:spacing w:after="60"/>
+        <w:jc w:val="center"/>
+      </w:pPr>
+      <w:r>
+        <w:rPr>
+          <w:b/>
+          <w:bCs/>
+          <w:color w:val="404040"/>
+          <w:sz w:val="19"/>
+          <w:szCs w:val="19"/>
+        </w:rPr>
+        <w:t xml:space="preserve">Task:</w:t>
+      </w:r>
+      <w:r>
+        <w:rPr>
+          <w:color w:val="404040"/>
+          <w:sz w:val="19"/>
+          <w:szCs w:val="19"/>
+        </w:rPr>
+        <w:t xml:space="preserve"> Regression. The model predicts the metered fare (USD) from information that is known at booking time.</w:t>
+      </w:r>
+    </w:p>
+    <w:p>
+      <w:pPr>
+        <w:spacing w:after="60"/>
+        <w:jc w:val="center"/>
+      </w:pPr>
+      <w:r>
+        <w:rPr>
+          <w:b/>
+          <w:bCs/>
+          <w:color w:val="404040"/>
+          <w:sz w:val="19"/>
+          <w:szCs w:val="19"/>
+        </w:rPr>
+        <w:t xml:space="preserve">Code:</w:t>
+      </w:r>
+      <w:r>
+        <w:rPr>
+          <w:color w:val="404040"/>
+          <w:sz w:val="19"/>
+          <w:szCs w:val="19"/>
+        </w:rPr>
+        <w:t xml:space="preserve"> </w:t>
+      </w:r>
+      <w:r>
+        <w:rPr>
+          <w:rFonts w:ascii="Consolas" w:cs="Consolas" w:eastAsia="Consolas" w:hAnsi="Consolas"/>
+          <w:color w:val="404040"/>
+          <w:sz w:val="19"/>
+          <w:szCs w:val="19"/>
+        </w:rPr>
+        <w:t xml:space="preserve">NYC_Taxi_Fare_Deliverable2.ipynb</w:t>
+      </w:r>
+      <w:r>
+        <w:rPr>
+          <w:color w:val="404040"/>
+          <w:sz w:val="19"/>
+          <w:szCs w:val="19"/>
+        </w:rPr>
+        <w:t xml:space="preserve"> (pandas, NumPy, Matplotlib, Seaborn, scikit-learn; runs in Google Colab)</w:t>
+      </w:r>
+    </w:p>
+    <w:p>
+      <w:pPr>
+        <w:pStyle w:val="Heading1"/>
+        <w:pageBreakBefore/>
+      </w:pPr>
+      <w:r>
+        <w:t xml:space="preserve">Introduction</w:t>
+      </w:r>
+    </w:p>
+    <w:p>
+      <w:pPr>
+        <w:pBdr>
+          <w:left w:val="single" w:color="1F4E79" w:sz="24" w:space="8"/>
+        </w:pBdr>
+        <w:shd w:fill="EAF1F8" w:color="auto" w:val="clear"/>
+        <w:spacing w:after="200" w:before="120"/>
+        <w:ind w:left="200" w:right="200"/>
+      </w:pPr>
+      <w:r>
+        <w:rPr>
+          <w:b/>
+          <w:bCs/>
+          <w:sz w:val="20"/>
+          <w:szCs w:val="20"/>
+        </w:rPr>
+        <w:t xml:space="preserve">Problem recap (Deliverable 1).</w:t>
+      </w:r>
+      <w:r>
+        <w:rPr>
+          <w:sz w:val="20"/>
+          <w:szCs w:val="20"/>
+        </w:rPr>
+        <w:t xml:space="preserve"> App-based ride services quote a price before the trip starts. A NYC taxi fare is only known when the meter stops. Taxi fleets, e-hail apps and the TLC want an accurate </w:t>
+      </w:r>
+      <w:r>
+        <w:rPr>
+          <w:b/>
+          <w:bCs/>
+          <w:sz w:val="20"/>
+          <w:szCs w:val="20"/>
+        </w:rPr>
+        <w:t xml:space="preserve">upfront fare estimate</w:t>
+      </w:r>
+      <w:r>
+        <w:rPr>
+          <w:sz w:val="20"/>
+          <w:szCs w:val="20"/>
+        </w:rPr>
+        <w:t xml:space="preserve"> so that riders can budget and compare transport options. In Deliverable 1 we cleaned the data (98.7% of rows kept) and built features that are known at booking time: distance, hour and day, boroughs, frequent zones, airport and JFK flat-fare flags, taxi colour and party size. We deliberately left out the outcome fields tip, tolls, total, duration and dropoff time to prevent leakage. We also set baselines. The last week of March (25–31 March, 1,363 trips) is held out as a time-based test set. All tuning uses 5-fold cross-validation (CV) on the first 3½ weeks (4,985 trips).</w:t>
+      </w:r>
+    </w:p>
+    <w:p>
+      <w:pPr>
+        <w:pStyle w:val="Heading1"/>
+      </w:pPr>
+      <w:r>
+        <w:t xml:space="preserve">1. Hyperparameter Tuning</w:t>
+      </w:r>
+    </w:p>
+    <w:p>
+      <w:pPr>
+        <w:spacing w:after="140"/>
+      </w:pPr>
+      <w:r>
+        <w:t xml:space="preserve">We tuned three model families, each wrapped in a scikit-learn </w:t>
+      </w:r>
+      <w:r>
+        <w:rPr>
+          <w:rFonts w:ascii="Consolas" w:cs="Consolas" w:eastAsia="Consolas" w:hAnsi="Consolas"/>
+          <w:sz w:val="19"/>
+          <w:szCs w:val="19"/>
+        </w:rPr>
+        <w:t xml:space="preserve">Pipeline</w:t>
+      </w:r>
+      <w:r>
+        <w:t xml:space="preserve">. The preprocessing is the same across models: numeric features are standardised for Ridge only, and categorical features are one-hot encoded with zones seen fewer than 20 times grouped together. The optimisation metric is </w:t>
+      </w:r>
+      <w:r>
+        <w:rPr>
+          <w:b/>
+          <w:bCs/>
+        </w:rPr>
+        <w:t xml:space="preserve">mean absolute error (MAE, in dollars)</w:t>
+      </w:r>
+      <w:r>
+        <w:t xml:space="preserve">. MAE is the average amount by which a quote misses the fare, and a few extreme trips affect it less than they affect RMSE.</w:t>
+      </w:r>
+    </w:p>
+    <w:tbl>
+      <w:tblPr>
+        <w:tblW w:type="dxa" w:w="9360"/>
+        <w:tblBorders>
+          <w:top w:val="single" w:color="auto" w:sz="4"/>
+          <w:left w:val="single" w:color="auto" w:sz="4"/>
+          <w:bottom w:val="single" w:color="auto" w:sz="4"/>
+          <w:right w:val="single" w:color="auto" w:sz="4"/>
+          <w:insideH w:val="single" w:color="auto" w:sz="4"/>
+          <w:insideV w:val="single" w:color="auto" w:sz="4"/>
+        </w:tblBorders>
+      </w:tblPr>
+      <w:tblGrid>
+        <w:gridCol w:w="1400"/>
+        <w:gridCol w:w="1750"/>
+        <w:gridCol w:w="2210"/>
+        <w:gridCol w:w="1000"/>
+        <w:gridCol w:w="1100"/>
+        <w:gridCol w:w="1100"/>
+        <w:gridCol w:w="800"/>
       </w:tblGrid>
       <w:tr>
         <w:trPr>
+          <w:cantSplit/>
           <w:tblHeader/>
         </w:trPr>
         <w:tc>
           <w:tcPr>
-            <w:tcW w:type="dxa" w:w="1476"/>
+            <w:tcW w:type="dxa" w:w="1400"/>
             <w:tcBorders>
               <w:top w:val="single" w:color="BFBFBF" w:sz="4"/>
               <w:left w:val="single" w:color="BFBFBF" w:sz="4"/>
@@ -228,9 +806,11 @@
               <w:bottom w:type="dxa" w:w="60"/>
               <w:right w:type="dxa" w:w="100"/>
             </w:tcMar>
-          </w:tcPr>
-          <w:p>
-            <w:pPr>
+            <w:vAlign w:val="center"/>
+          </w:tcPr>
+          <w:p>
+            <w:pPr>
+              <w:keepNext/>
               <w:spacing w:after="0" w:before="0"/>
               <w:jc w:val="left"/>
             </w:pPr>
@@ -248,7 +828,7 @@
         </w:tc>
         <w:tc>
           <w:tcPr>
-            <w:tcW w:type="dxa" w:w="1155"/>
+            <w:tcW w:type="dxa" w:w="1750"/>
             <w:tcBorders>
               <w:top w:val="single" w:color="BFBFBF" w:sz="4"/>
               <w:left w:val="single" w:color="BFBFBF" w:sz="4"/>
@@ -262,9 +842,11 @@
               <w:bottom w:type="dxa" w:w="60"/>
               <w:right w:type="dxa" w:w="100"/>
             </w:tcMar>
-          </w:tcPr>
-          <w:p>
-            <w:pPr>
+            <w:vAlign w:val="center"/>
+          </w:tcPr>
+          <w:p>
+            <w:pPr>
+              <w:keepNext/>
               <w:spacing w:after="0" w:before="0"/>
               <w:jc w:val="left"/>
             </w:pPr>
@@ -282,7 +864,7 @@
         </w:tc>
         <w:tc>
           <w:tcPr>
-            <w:tcW w:type="dxa" w:w="3403"/>
+            <w:tcW w:type="dxa" w:w="2210"/>
             <w:tcBorders>
               <w:top w:val="single" w:color="BFBFBF" w:sz="4"/>
               <w:left w:val="single" w:color="BFBFBF" w:sz="4"/>
@@ -296,9 +878,11 @@
               <w:bottom w:type="dxa" w:w="60"/>
               <w:right w:type="dxa" w:w="100"/>
             </w:tcMar>
-          </w:tcPr>
-          <w:p>
-            <w:pPr>
+            <w:vAlign w:val="center"/>
+          </w:tcPr>
+          <w:p>
+            <w:pPr>
+              <w:keepNext/>
               <w:spacing w:after="0" w:before="0"/>
               <w:jc w:val="left"/>
             </w:pPr>
@@ -316,7 +900,7 @@
         </w:tc>
         <w:tc>
           <w:tcPr>
-            <w:tcW w:type="dxa" w:w="808"/>
+            <w:tcW w:type="dxa" w:w="1000"/>
             <w:tcBorders>
               <w:top w:val="single" w:color="BFBFBF" w:sz="4"/>
               <w:left w:val="single" w:color="BFBFBF" w:sz="4"/>
@@ -330,9 +914,11 @@
               <w:bottom w:type="dxa" w:w="60"/>
               <w:right w:type="dxa" w:w="100"/>
             </w:tcMar>
-          </w:tcPr>
-          <w:p>
-            <w:pPr>
+            <w:vAlign w:val="center"/>
+          </w:tcPr>
+          <w:p>
+            <w:pPr>
+              <w:keepNext/>
               <w:spacing w:after="0" w:before="0"/>
               <w:jc w:val="left"/>
             </w:pPr>
@@ -350,7 +936,7 @@
         </w:tc>
         <w:tc>
           <w:tcPr>
-            <w:tcW w:type="dxa" w:w="898"/>
+            <w:tcW w:type="dxa" w:w="1100"/>
             <w:tcBorders>
               <w:top w:val="single" w:color="BFBFBF" w:sz="4"/>
               <w:left w:val="single" w:color="BFBFBF" w:sz="4"/>
@@ -364,9 +950,11 @@
               <w:bottom w:type="dxa" w:w="60"/>
               <w:right w:type="dxa" w:w="100"/>
             </w:tcMar>
-          </w:tcPr>
-          <w:p>
-            <w:pPr>
+            <w:vAlign w:val="center"/>
+          </w:tcPr>
+          <w:p>
+            <w:pPr>
+              <w:keepNext/>
               <w:spacing w:after="0" w:before="0"/>
               <w:jc w:val="left"/>
             </w:pPr>
@@ -384,7 +972,7 @@
         </w:tc>
         <w:tc>
           <w:tcPr>
-            <w:tcW w:type="dxa" w:w="808"/>
+            <w:tcW w:type="dxa" w:w="1100"/>
             <w:tcBorders>
               <w:top w:val="single" w:color="BFBFBF" w:sz="4"/>
               <w:left w:val="single" w:color="BFBFBF" w:sz="4"/>
@@ -398,9 +986,11 @@
               <w:bottom w:type="dxa" w:w="60"/>
               <w:right w:type="dxa" w:w="100"/>
             </w:tcMar>
-          </w:tcPr>
-          <w:p>
-            <w:pPr>
+            <w:vAlign w:val="center"/>
+          </w:tcPr>
+          <w:p>
+            <w:pPr>
+              <w:keepNext/>
               <w:spacing w:after="0" w:before="0"/>
               <w:jc w:val="left"/>
             </w:pPr>
@@ -418,7 +1008,7 @@
         </w:tc>
         <w:tc>
           <w:tcPr>
-            <w:tcW w:type="dxa" w:w="812"/>
+            <w:tcW w:type="dxa" w:w="800"/>
             <w:tcBorders>
               <w:top w:val="single" w:color="BFBFBF" w:sz="4"/>
               <w:left w:val="single" w:color="BFBFBF" w:sz="4"/>
@@ -432,9 +1022,11 @@
               <w:bottom w:type="dxa" w:w="60"/>
               <w:right w:type="dxa" w:w="100"/>
             </w:tcMar>
-          </w:tcPr>
-          <w:p>
-            <w:pPr>
+            <w:vAlign w:val="center"/>
+          </w:tcPr>
+          <w:p>
+            <w:pPr>
+              <w:keepNext/>
               <w:spacing w:after="0" w:before="0"/>
               <w:jc w:val="left"/>
             </w:pPr>
@@ -453,26 +1045,29 @@
       </w:tr>
       <w:tr>
         <w:trPr>
+          <w:cantSplit/>
           <w:tblHeader w:val="false"/>
         </w:trPr>
         <w:tc>
           <w:tcPr>
-            <w:tcW w:type="dxa" w:w="1476"/>
-            <w:tcBorders>
-              <w:top w:val="single" w:color="BFBFBF" w:sz="4"/>
-              <w:left w:val="single" w:color="BFBFBF" w:sz="4"/>
-              <w:bottom w:val="single" w:color="BFBFBF" w:sz="4"/>
-              <w:right w:val="single" w:color="BFBFBF" w:sz="4"/>
-            </w:tcBorders>
-            <w:tcMar>
-              <w:top w:type="dxa" w:w="60"/>
-              <w:left w:type="dxa" w:w="100"/>
-              <w:bottom w:type="dxa" w:w="60"/>
-              <w:right w:type="dxa" w:w="100"/>
-            </w:tcMar>
-          </w:tcPr>
-          <w:p>
-            <w:pPr>
+            <w:tcW w:type="dxa" w:w="1400"/>
+            <w:tcBorders>
+              <w:top w:val="single" w:color="BFBFBF" w:sz="4"/>
+              <w:left w:val="single" w:color="BFBFBF" w:sz="4"/>
+              <w:bottom w:val="single" w:color="BFBFBF" w:sz="4"/>
+              <w:right w:val="single" w:color="BFBFBF" w:sz="4"/>
+            </w:tcBorders>
+            <w:tcMar>
+              <w:top w:type="dxa" w:w="60"/>
+              <w:left w:type="dxa" w:w="100"/>
+              <w:bottom w:type="dxa" w:w="60"/>
+              <w:right w:type="dxa" w:w="100"/>
+            </w:tcMar>
+            <w:vAlign w:val="center"/>
+          </w:tcPr>
+          <w:p>
+            <w:pPr>
+              <w:keepNext/>
               <w:spacing w:after="0" w:before="0"/>
               <w:jc w:val="left"/>
             </w:pPr>
@@ -487,22 +1082,24 @@
         </w:tc>
         <w:tc>
           <w:tcPr>
-            <w:tcW w:type="dxa" w:w="1155"/>
-            <w:tcBorders>
-              <w:top w:val="single" w:color="BFBFBF" w:sz="4"/>
-              <w:left w:val="single" w:color="BFBFBF" w:sz="4"/>
-              <w:bottom w:val="single" w:color="BFBFBF" w:sz="4"/>
-              <w:right w:val="single" w:color="BFBFBF" w:sz="4"/>
-            </w:tcBorders>
-            <w:tcMar>
-              <w:top w:type="dxa" w:w="60"/>
-              <w:left w:type="dxa" w:w="100"/>
-              <w:bottom w:type="dxa" w:w="60"/>
-              <w:right w:type="dxa" w:w="100"/>
-            </w:tcMar>
-          </w:tcPr>
-          <w:p>
-            <w:pPr>
+            <w:tcW w:type="dxa" w:w="1750"/>
+            <w:tcBorders>
+              <w:top w:val="single" w:color="BFBFBF" w:sz="4"/>
+              <w:left w:val="single" w:color="BFBFBF" w:sz="4"/>
+              <w:bottom w:val="single" w:color="BFBFBF" w:sz="4"/>
+              <w:right w:val="single" w:color="BFBFBF" w:sz="4"/>
+            </w:tcBorders>
+            <w:tcMar>
+              <w:top w:type="dxa" w:w="60"/>
+              <w:left w:type="dxa" w:w="100"/>
+              <w:bottom w:type="dxa" w:w="60"/>
+              <w:right w:type="dxa" w:w="100"/>
+            </w:tcMar>
+            <w:vAlign w:val="center"/>
+          </w:tcPr>
+          <w:p>
+            <w:pPr>
+              <w:keepNext/>
               <w:spacing w:after="0" w:before="0"/>
               <w:jc w:val="left"/>
             </w:pPr>
@@ -518,22 +1115,24 @@
         </w:tc>
         <w:tc>
           <w:tcPr>
-            <w:tcW w:type="dxa" w:w="3403"/>
-            <w:tcBorders>
-              <w:top w:val="single" w:color="BFBFBF" w:sz="4"/>
-              <w:left w:val="single" w:color="BFBFBF" w:sz="4"/>
-              <w:bottom w:val="single" w:color="BFBFBF" w:sz="4"/>
-              <w:right w:val="single" w:color="BFBFBF" w:sz="4"/>
-            </w:tcBorders>
-            <w:tcMar>
-              <w:top w:type="dxa" w:w="60"/>
-              <w:left w:type="dxa" w:w="100"/>
-              <w:bottom w:type="dxa" w:w="60"/>
-              <w:right w:type="dxa" w:w="100"/>
-            </w:tcMar>
-          </w:tcPr>
-          <w:p>
-            <w:pPr>
+            <w:tcW w:type="dxa" w:w="2210"/>
+            <w:tcBorders>
+              <w:top w:val="single" w:color="BFBFBF" w:sz="4"/>
+              <w:left w:val="single" w:color="BFBFBF" w:sz="4"/>
+              <w:bottom w:val="single" w:color="BFBFBF" w:sz="4"/>
+              <w:right w:val="single" w:color="BFBFBF" w:sz="4"/>
+            </w:tcBorders>
+            <w:tcMar>
+              <w:top w:type="dxa" w:w="60"/>
+              <w:left w:type="dxa" w:w="100"/>
+              <w:bottom w:type="dxa" w:w="60"/>
+              <w:right w:type="dxa" w:w="100"/>
+            </w:tcMar>
+            <w:vAlign w:val="center"/>
+          </w:tcPr>
+          <w:p>
+            <w:pPr>
+              <w:keepNext/>
               <w:spacing w:after="0" w:before="0"/>
               <w:jc w:val="left"/>
             </w:pPr>
@@ -556,24 +1155,26 @@
         </w:tc>
         <w:tc>
           <w:tcPr>
-            <w:tcW w:type="dxa" w:w="808"/>
-            <w:tcBorders>
-              <w:top w:val="single" w:color="BFBFBF" w:sz="4"/>
-              <w:left w:val="single" w:color="BFBFBF" w:sz="4"/>
-              <w:bottom w:val="single" w:color="BFBFBF" w:sz="4"/>
-              <w:right w:val="single" w:color="BFBFBF" w:sz="4"/>
-            </w:tcBorders>
-            <w:tcMar>
-              <w:top w:type="dxa" w:w="60"/>
-              <w:left w:type="dxa" w:w="100"/>
-              <w:bottom w:type="dxa" w:w="60"/>
-              <w:right w:type="dxa" w:w="100"/>
-            </w:tcMar>
-          </w:tcPr>
-          <w:p>
-            <w:pPr>
-              <w:spacing w:after="0" w:before="0"/>
-              <w:jc w:val="right"/>
+            <w:tcW w:type="dxa" w:w="1000"/>
+            <w:tcBorders>
+              <w:top w:val="single" w:color="BFBFBF" w:sz="4"/>
+              <w:left w:val="single" w:color="BFBFBF" w:sz="4"/>
+              <w:bottom w:val="single" w:color="BFBFBF" w:sz="4"/>
+              <w:right w:val="single" w:color="BFBFBF" w:sz="4"/>
+            </w:tcBorders>
+            <w:tcMar>
+              <w:top w:type="dxa" w:w="60"/>
+              <w:left w:type="dxa" w:w="100"/>
+              <w:bottom w:type="dxa" w:w="60"/>
+              <w:right w:type="dxa" w:w="100"/>
+            </w:tcMar>
+            <w:vAlign w:val="center"/>
+          </w:tcPr>
+          <w:p>
+            <w:pPr>
+              <w:keepNext/>
+              <w:spacing w:after="0" w:before="0"/>
+              <w:jc w:val="center"/>
             </w:pPr>
             <w:r>
               <w:rPr>
@@ -586,24 +1187,26 @@
         </w:tc>
         <w:tc>
           <w:tcPr>
-            <w:tcW w:type="dxa" w:w="898"/>
-            <w:tcBorders>
-              <w:top w:val="single" w:color="BFBFBF" w:sz="4"/>
-              <w:left w:val="single" w:color="BFBFBF" w:sz="4"/>
-              <w:bottom w:val="single" w:color="BFBFBF" w:sz="4"/>
-              <w:right w:val="single" w:color="BFBFBF" w:sz="4"/>
-            </w:tcBorders>
-            <w:tcMar>
-              <w:top w:type="dxa" w:w="60"/>
-              <w:left w:type="dxa" w:w="100"/>
-              <w:bottom w:type="dxa" w:w="60"/>
-              <w:right w:type="dxa" w:w="100"/>
-            </w:tcMar>
-          </w:tcPr>
-          <w:p>
-            <w:pPr>
-              <w:spacing w:after="0" w:before="0"/>
-              <w:jc w:val="right"/>
+            <w:tcW w:type="dxa" w:w="1100"/>
+            <w:tcBorders>
+              <w:top w:val="single" w:color="BFBFBF" w:sz="4"/>
+              <w:left w:val="single" w:color="BFBFBF" w:sz="4"/>
+              <w:bottom w:val="single" w:color="BFBFBF" w:sz="4"/>
+              <w:right w:val="single" w:color="BFBFBF" w:sz="4"/>
+            </w:tcBorders>
+            <w:tcMar>
+              <w:top w:type="dxa" w:w="60"/>
+              <w:left w:type="dxa" w:w="100"/>
+              <w:bottom w:type="dxa" w:w="60"/>
+              <w:right w:type="dxa" w:w="100"/>
+            </w:tcMar>
+            <w:vAlign w:val="center"/>
+          </w:tcPr>
+          <w:p>
+            <w:pPr>
+              <w:keepNext/>
+              <w:spacing w:after="0" w:before="0"/>
+              <w:jc w:val="center"/>
             </w:pPr>
             <w:r>
               <w:rPr>
@@ -616,24 +1219,26 @@
         </w:tc>
         <w:tc>
           <w:tcPr>
-            <w:tcW w:type="dxa" w:w="808"/>
-            <w:tcBorders>
-              <w:top w:val="single" w:color="BFBFBF" w:sz="4"/>
-              <w:left w:val="single" w:color="BFBFBF" w:sz="4"/>
-              <w:bottom w:val="single" w:color="BFBFBF" w:sz="4"/>
-              <w:right w:val="single" w:color="BFBFBF" w:sz="4"/>
-            </w:tcBorders>
-            <w:tcMar>
-              <w:top w:type="dxa" w:w="60"/>
-              <w:left w:type="dxa" w:w="100"/>
-              <w:bottom w:type="dxa" w:w="60"/>
-              <w:right w:type="dxa" w:w="100"/>
-            </w:tcMar>
-          </w:tcPr>
-          <w:p>
-            <w:pPr>
-              <w:spacing w:after="0" w:before="0"/>
-              <w:jc w:val="right"/>
+            <w:tcW w:type="dxa" w:w="1100"/>
+            <w:tcBorders>
+              <w:top w:val="single" w:color="BFBFBF" w:sz="4"/>
+              <w:left w:val="single" w:color="BFBFBF" w:sz="4"/>
+              <w:bottom w:val="single" w:color="BFBFBF" w:sz="4"/>
+              <w:right w:val="single" w:color="BFBFBF" w:sz="4"/>
+            </w:tcBorders>
+            <w:tcMar>
+              <w:top w:type="dxa" w:w="60"/>
+              <w:left w:type="dxa" w:w="100"/>
+              <w:bottom w:type="dxa" w:w="60"/>
+              <w:right w:type="dxa" w:w="100"/>
+            </w:tcMar>
+            <w:vAlign w:val="center"/>
+          </w:tcPr>
+          <w:p>
+            <w:pPr>
+              <w:keepNext/>
+              <w:spacing w:after="0" w:before="0"/>
+              <w:jc w:val="center"/>
             </w:pPr>
             <w:r>
               <w:rPr>
@@ -648,24 +1253,26 @@
         </w:tc>
         <w:tc>
           <w:tcPr>
-            <w:tcW w:type="dxa" w:w="812"/>
-            <w:tcBorders>
-              <w:top w:val="single" w:color="BFBFBF" w:sz="4"/>
-              <w:left w:val="single" w:color="BFBFBF" w:sz="4"/>
-              <w:bottom w:val="single" w:color="BFBFBF" w:sz="4"/>
-              <w:right w:val="single" w:color="BFBFBF" w:sz="4"/>
-            </w:tcBorders>
-            <w:tcMar>
-              <w:top w:type="dxa" w:w="60"/>
-              <w:left w:type="dxa" w:w="100"/>
-              <w:bottom w:type="dxa" w:w="60"/>
-              <w:right w:type="dxa" w:w="100"/>
-            </w:tcMar>
-          </w:tcPr>
-          <w:p>
-            <w:pPr>
-              <w:spacing w:after="0" w:before="0"/>
-              <w:jc w:val="right"/>
+            <w:tcW w:type="dxa" w:w="800"/>
+            <w:tcBorders>
+              <w:top w:val="single" w:color="BFBFBF" w:sz="4"/>
+              <w:left w:val="single" w:color="BFBFBF" w:sz="4"/>
+              <w:bottom w:val="single" w:color="BFBFBF" w:sz="4"/>
+              <w:right w:val="single" w:color="BFBFBF" w:sz="4"/>
+            </w:tcBorders>
+            <w:tcMar>
+              <w:top w:type="dxa" w:w="60"/>
+              <w:left w:type="dxa" w:w="100"/>
+              <w:bottom w:type="dxa" w:w="60"/>
+              <w:right w:type="dxa" w:w="100"/>
+            </w:tcMar>
+            <w:vAlign w:val="center"/>
+          </w:tcPr>
+          <w:p>
+            <w:pPr>
+              <w:keepNext/>
+              <w:spacing w:after="0" w:before="0"/>
+              <w:jc w:val="center"/>
             </w:pPr>
             <w:r>
               <w:rPr>
@@ -679,11 +1286,12 @@
       </w:tr>
       <w:tr>
         <w:trPr>
+          <w:cantSplit/>
           <w:tblHeader w:val="false"/>
         </w:trPr>
         <w:tc>
           <w:tcPr>
-            <w:tcW w:type="dxa" w:w="1476"/>
+            <w:tcW w:type="dxa" w:w="1400"/>
             <w:tcBorders>
               <w:top w:val="single" w:color="BFBFBF" w:sz="4"/>
               <w:left w:val="single" w:color="BFBFBF" w:sz="4"/>
@@ -697,9 +1305,11 @@
               <w:bottom w:type="dxa" w:w="60"/>
               <w:right w:type="dxa" w:w="100"/>
             </w:tcMar>
-          </w:tcPr>
-          <w:p>
-            <w:pPr>
+            <w:vAlign w:val="center"/>
+          </w:tcPr>
+          <w:p>
+            <w:pPr>
+              <w:keepNext/>
               <w:spacing w:after="0" w:before="0"/>
               <w:jc w:val="left"/>
             </w:pPr>
@@ -714,7 +1324,7 @@
         </w:tc>
         <w:tc>
           <w:tcPr>
-            <w:tcW w:type="dxa" w:w="1155"/>
+            <w:tcW w:type="dxa" w:w="1750"/>
             <w:tcBorders>
               <w:top w:val="single" w:color="BFBFBF" w:sz="4"/>
               <w:left w:val="single" w:color="BFBFBF" w:sz="4"/>
@@ -728,9 +1338,11 @@
               <w:bottom w:type="dxa" w:w="60"/>
               <w:right w:type="dxa" w:w="100"/>
             </w:tcMar>
-          </w:tcPr>
-          <w:p>
-            <w:pPr>
+            <w:vAlign w:val="center"/>
+          </w:tcPr>
+          <w:p>
+            <w:pPr>
+              <w:keepNext/>
               <w:spacing w:after="0" w:before="0"/>
               <w:jc w:val="left"/>
             </w:pPr>
@@ -746,7 +1358,7 @@
         </w:tc>
         <w:tc>
           <w:tcPr>
-            <w:tcW w:type="dxa" w:w="3403"/>
+            <w:tcW w:type="dxa" w:w="2210"/>
             <w:tcBorders>
               <w:top w:val="single" w:color="BFBFBF" w:sz="4"/>
               <w:left w:val="single" w:color="BFBFBF" w:sz="4"/>
@@ -760,9 +1372,11 @@
               <w:bottom w:type="dxa" w:w="60"/>
               <w:right w:type="dxa" w:w="100"/>
             </w:tcMar>
-          </w:tcPr>
-          <w:p>
-            <w:pPr>
+            <w:vAlign w:val="center"/>
+          </w:tcPr>
+          <w:p>
+            <w:pPr>
+              <w:keepNext/>
               <w:spacing w:after="0" w:before="0"/>
               <w:jc w:val="left"/>
             </w:pPr>
@@ -777,7 +1391,7 @@
         </w:tc>
         <w:tc>
           <w:tcPr>
-            <w:tcW w:type="dxa" w:w="808"/>
+            <w:tcW w:type="dxa" w:w="1000"/>
             <w:tcBorders>
               <w:top w:val="single" w:color="BFBFBF" w:sz="4"/>
               <w:left w:val="single" w:color="BFBFBF" w:sz="4"/>
@@ -791,11 +1405,13 @@
               <w:bottom w:type="dxa" w:w="60"/>
               <w:right w:type="dxa" w:w="100"/>
             </w:tcMar>
-          </w:tcPr>
-          <w:p>
-            <w:pPr>
-              <w:spacing w:after="0" w:before="0"/>
-              <w:jc w:val="right"/>
+            <w:vAlign w:val="center"/>
+          </w:tcPr>
+          <w:p>
+            <w:pPr>
+              <w:keepNext/>
+              <w:spacing w:after="0" w:before="0"/>
+              <w:jc w:val="center"/>
             </w:pPr>
             <w:r>
               <w:rPr>
@@ -808,7 +1424,7 @@
         </w:tc>
         <w:tc>
           <w:tcPr>
-            <w:tcW w:type="dxa" w:w="898"/>
+            <w:tcW w:type="dxa" w:w="1100"/>
             <w:tcBorders>
               <w:top w:val="single" w:color="BFBFBF" w:sz="4"/>
               <w:left w:val="single" w:color="BFBFBF" w:sz="4"/>
@@ -822,11 +1438,13 @@
               <w:bottom w:type="dxa" w:w="60"/>
               <w:right w:type="dxa" w:w="100"/>
             </w:tcMar>
-          </w:tcPr>
-          <w:p>
-            <w:pPr>
-              <w:spacing w:after="0" w:before="0"/>
-              <w:jc w:val="right"/>
+            <w:vAlign w:val="center"/>
+          </w:tcPr>
+          <w:p>
+            <w:pPr>
+              <w:keepNext/>
+              <w:spacing w:after="0" w:before="0"/>
+              <w:jc w:val="center"/>
             </w:pPr>
             <w:r>
               <w:rPr>
@@ -839,7 +1457,7 @@
         </w:tc>
         <w:tc>
           <w:tcPr>
-            <w:tcW w:type="dxa" w:w="808"/>
+            <w:tcW w:type="dxa" w:w="1100"/>
             <w:tcBorders>
               <w:top w:val="single" w:color="BFBFBF" w:sz="4"/>
               <w:left w:val="single" w:color="BFBFBF" w:sz="4"/>
@@ -853,11 +1471,13 @@
               <w:bottom w:type="dxa" w:w="60"/>
               <w:right w:type="dxa" w:w="100"/>
             </w:tcMar>
-          </w:tcPr>
-          <w:p>
-            <w:pPr>
-              <w:spacing w:after="0" w:before="0"/>
-              <w:jc w:val="right"/>
+            <w:vAlign w:val="center"/>
+          </w:tcPr>
+          <w:p>
+            <w:pPr>
+              <w:keepNext/>
+              <w:spacing w:after="0" w:before="0"/>
+              <w:jc w:val="center"/>
             </w:pPr>
             <w:r>
               <w:rPr>
@@ -872,7 +1492,7 @@
         </w:tc>
         <w:tc>
           <w:tcPr>
-            <w:tcW w:type="dxa" w:w="812"/>
+            <w:tcW w:type="dxa" w:w="800"/>
             <w:tcBorders>
               <w:top w:val="single" w:color="BFBFBF" w:sz="4"/>
               <w:left w:val="single" w:color="BFBFBF" w:sz="4"/>
@@ -886,11 +1506,13 @@
               <w:bottom w:type="dxa" w:w="60"/>
               <w:right w:type="dxa" w:w="100"/>
             </w:tcMar>
-          </w:tcPr>
-          <w:p>
-            <w:pPr>
-              <w:spacing w:after="0" w:before="0"/>
-              <w:jc w:val="right"/>
+            <w:vAlign w:val="center"/>
+          </w:tcPr>
+          <w:p>
+            <w:pPr>
+              <w:keepNext/>
+              <w:spacing w:after="0" w:before="0"/>
+              <w:jc w:val="center"/>
             </w:pPr>
             <w:r>
               <w:rPr>
@@ -904,26 +1526,29 @@
       </w:tr>
       <w:tr>
         <w:trPr>
+          <w:cantSplit/>
           <w:tblHeader w:val="false"/>
         </w:trPr>
         <w:tc>
           <w:tcPr>
-            <w:tcW w:type="dxa" w:w="1476"/>
-            <w:tcBorders>
-              <w:top w:val="single" w:color="BFBFBF" w:sz="4"/>
-              <w:left w:val="single" w:color="BFBFBF" w:sz="4"/>
-              <w:bottom w:val="single" w:color="BFBFBF" w:sz="4"/>
-              <w:right w:val="single" w:color="BFBFBF" w:sz="4"/>
-            </w:tcBorders>
-            <w:tcMar>
-              <w:top w:type="dxa" w:w="60"/>
-              <w:left w:type="dxa" w:w="100"/>
-              <w:bottom w:type="dxa" w:w="60"/>
-              <w:right w:type="dxa" w:w="100"/>
-            </w:tcMar>
-          </w:tcPr>
-          <w:p>
-            <w:pPr>
+            <w:tcW w:type="dxa" w:w="1400"/>
+            <w:tcBorders>
+              <w:top w:val="single" w:color="BFBFBF" w:sz="4"/>
+              <w:left w:val="single" w:color="BFBFBF" w:sz="4"/>
+              <w:bottom w:val="single" w:color="BFBFBF" w:sz="4"/>
+              <w:right w:val="single" w:color="BFBFBF" w:sz="4"/>
+            </w:tcBorders>
+            <w:tcMar>
+              <w:top w:type="dxa" w:w="60"/>
+              <w:left w:type="dxa" w:w="100"/>
+              <w:bottom w:type="dxa" w:w="60"/>
+              <w:right w:type="dxa" w:w="100"/>
+            </w:tcMar>
+            <w:vAlign w:val="center"/>
+          </w:tcPr>
+          <w:p>
+            <w:pPr>
+              <w:keepNext w:val="false"/>
               <w:spacing w:after="0" w:before="0"/>
               <w:jc w:val="left"/>
             </w:pPr>
@@ -938,22 +1563,24 @@
         </w:tc>
         <w:tc>
           <w:tcPr>
-            <w:tcW w:type="dxa" w:w="1155"/>
-            <w:tcBorders>
-              <w:top w:val="single" w:color="BFBFBF" w:sz="4"/>
-              <w:left w:val="single" w:color="BFBFBF" w:sz="4"/>
-              <w:bottom w:val="single" w:color="BFBFBF" w:sz="4"/>
-              <w:right w:val="single" w:color="BFBFBF" w:sz="4"/>
-            </w:tcBorders>
-            <w:tcMar>
-              <w:top w:type="dxa" w:w="60"/>
-              <w:left w:type="dxa" w:w="100"/>
-              <w:bottom w:type="dxa" w:w="60"/>
-              <w:right w:type="dxa" w:w="100"/>
-            </w:tcMar>
-          </w:tcPr>
-          <w:p>
-            <w:pPr>
+            <w:tcW w:type="dxa" w:w="1750"/>
+            <w:tcBorders>
+              <w:top w:val="single" w:color="BFBFBF" w:sz="4"/>
+              <w:left w:val="single" w:color="BFBFBF" w:sz="4"/>
+              <w:bottom w:val="single" w:color="BFBFBF" w:sz="4"/>
+              <w:right w:val="single" w:color="BFBFBF" w:sz="4"/>
+            </w:tcBorders>
+            <w:tcMar>
+              <w:top w:type="dxa" w:w="60"/>
+              <w:left w:type="dxa" w:w="100"/>
+              <w:bottom w:type="dxa" w:w="60"/>
+              <w:right w:type="dxa" w:w="100"/>
+            </w:tcMar>
+            <w:vAlign w:val="center"/>
+          </w:tcPr>
+          <w:p>
+            <w:pPr>
+              <w:keepNext w:val="false"/>
               <w:spacing w:after="0" w:before="0"/>
               <w:jc w:val="left"/>
             </w:pPr>
@@ -969,22 +1596,24 @@
         </w:tc>
         <w:tc>
           <w:tcPr>
-            <w:tcW w:type="dxa" w:w="3403"/>
-            <w:tcBorders>
-              <w:top w:val="single" w:color="BFBFBF" w:sz="4"/>
-              <w:left w:val="single" w:color="BFBFBF" w:sz="4"/>
-              <w:bottom w:val="single" w:color="BFBFBF" w:sz="4"/>
-              <w:right w:val="single" w:color="BFBFBF" w:sz="4"/>
-            </w:tcBorders>
-            <w:tcMar>
-              <w:top w:type="dxa" w:w="60"/>
-              <w:left w:type="dxa" w:w="100"/>
-              <w:bottom w:type="dxa" w:w="60"/>
-              <w:right w:type="dxa" w:w="100"/>
-            </w:tcMar>
-          </w:tcPr>
-          <w:p>
-            <w:pPr>
+            <w:tcW w:type="dxa" w:w="2210"/>
+            <w:tcBorders>
+              <w:top w:val="single" w:color="BFBFBF" w:sz="4"/>
+              <w:left w:val="single" w:color="BFBFBF" w:sz="4"/>
+              <w:bottom w:val="single" w:color="BFBFBF" w:sz="4"/>
+              <w:right w:val="single" w:color="BFBFBF" w:sz="4"/>
+            </w:tcBorders>
+            <w:tcMar>
+              <w:top w:type="dxa" w:w="60"/>
+              <w:left w:type="dxa" w:w="100"/>
+              <w:bottom w:type="dxa" w:w="60"/>
+              <w:right w:type="dxa" w:w="100"/>
+            </w:tcMar>
+            <w:vAlign w:val="center"/>
+          </w:tcPr>
+          <w:p>
+            <w:pPr>
+              <w:keepNext w:val="false"/>
               <w:spacing w:after="0" w:before="0"/>
               <w:jc w:val="left"/>
             </w:pPr>
@@ -999,24 +1628,26 @@
         </w:tc>
         <w:tc>
           <w:tcPr>
-            <w:tcW w:type="dxa" w:w="808"/>
-            <w:tcBorders>
-              <w:top w:val="single" w:color="BFBFBF" w:sz="4"/>
-              <w:left w:val="single" w:color="BFBFBF" w:sz="4"/>
-              <w:bottom w:val="single" w:color="BFBFBF" w:sz="4"/>
-              <w:right w:val="single" w:color="BFBFBF" w:sz="4"/>
-            </w:tcBorders>
-            <w:tcMar>
-              <w:top w:type="dxa" w:w="60"/>
-              <w:left w:type="dxa" w:w="100"/>
-              <w:bottom w:type="dxa" w:w="60"/>
-              <w:right w:type="dxa" w:w="100"/>
-            </w:tcMar>
-          </w:tcPr>
-          <w:p>
-            <w:pPr>
-              <w:spacing w:after="0" w:before="0"/>
-              <w:jc w:val="right"/>
+            <w:tcW w:type="dxa" w:w="1000"/>
+            <w:tcBorders>
+              <w:top w:val="single" w:color="BFBFBF" w:sz="4"/>
+              <w:left w:val="single" w:color="BFBFBF" w:sz="4"/>
+              <w:bottom w:val="single" w:color="BFBFBF" w:sz="4"/>
+              <w:right w:val="single" w:color="BFBFBF" w:sz="4"/>
+            </w:tcBorders>
+            <w:tcMar>
+              <w:top w:type="dxa" w:w="60"/>
+              <w:left w:type="dxa" w:w="100"/>
+              <w:bottom w:type="dxa" w:w="60"/>
+              <w:right w:type="dxa" w:w="100"/>
+            </w:tcMar>
+            <w:vAlign w:val="center"/>
+          </w:tcPr>
+          <w:p>
+            <w:pPr>
+              <w:keepNext w:val="false"/>
+              <w:spacing w:after="0" w:before="0"/>
+              <w:jc w:val="center"/>
             </w:pPr>
             <w:r>
               <w:rPr>
@@ -1029,24 +1660,26 @@
         </w:tc>
         <w:tc>
           <w:tcPr>
-            <w:tcW w:type="dxa" w:w="898"/>
-            <w:tcBorders>
-              <w:top w:val="single" w:color="BFBFBF" w:sz="4"/>
-              <w:left w:val="single" w:color="BFBFBF" w:sz="4"/>
-              <w:bottom w:val="single" w:color="BFBFBF" w:sz="4"/>
-              <w:right w:val="single" w:color="BFBFBF" w:sz="4"/>
-            </w:tcBorders>
-            <w:tcMar>
-              <w:top w:type="dxa" w:w="60"/>
-              <w:left w:type="dxa" w:w="100"/>
-              <w:bottom w:type="dxa" w:w="60"/>
-              <w:right w:type="dxa" w:w="100"/>
-            </w:tcMar>
-          </w:tcPr>
-          <w:p>
-            <w:pPr>
-              <w:spacing w:after="0" w:before="0"/>
-              <w:jc w:val="right"/>
+            <w:tcW w:type="dxa" w:w="1100"/>
+            <w:tcBorders>
+              <w:top w:val="single" w:color="BFBFBF" w:sz="4"/>
+              <w:left w:val="single" w:color="BFBFBF" w:sz="4"/>
+              <w:bottom w:val="single" w:color="BFBFBF" w:sz="4"/>
+              <w:right w:val="single" w:color="BFBFBF" w:sz="4"/>
+            </w:tcBorders>
+            <w:tcMar>
+              <w:top w:type="dxa" w:w="60"/>
+              <w:left w:type="dxa" w:w="100"/>
+              <w:bottom w:type="dxa" w:w="60"/>
+              <w:right w:type="dxa" w:w="100"/>
+            </w:tcMar>
+            <w:vAlign w:val="center"/>
+          </w:tcPr>
+          <w:p>
+            <w:pPr>
+              <w:keepNext w:val="false"/>
+              <w:spacing w:after="0" w:before="0"/>
+              <w:jc w:val="center"/>
             </w:pPr>
             <w:r>
               <w:rPr>
@@ -1059,24 +1692,26 @@
         </w:tc>
         <w:tc>
           <w:tcPr>
-            <w:tcW w:type="dxa" w:w="808"/>
-            <w:tcBorders>
-              <w:top w:val="single" w:color="BFBFBF" w:sz="4"/>
-              <w:left w:val="single" w:color="BFBFBF" w:sz="4"/>
-              <w:bottom w:val="single" w:color="BFBFBF" w:sz="4"/>
-              <w:right w:val="single" w:color="BFBFBF" w:sz="4"/>
-            </w:tcBorders>
-            <w:tcMar>
-              <w:top w:type="dxa" w:w="60"/>
-              <w:left w:type="dxa" w:w="100"/>
-              <w:bottom w:type="dxa" w:w="60"/>
-              <w:right w:type="dxa" w:w="100"/>
-            </w:tcMar>
-          </w:tcPr>
-          <w:p>
-            <w:pPr>
-              <w:spacing w:after="0" w:before="0"/>
-              <w:jc w:val="right"/>
+            <w:tcW w:type="dxa" w:w="1100"/>
+            <w:tcBorders>
+              <w:top w:val="single" w:color="BFBFBF" w:sz="4"/>
+              <w:left w:val="single" w:color="BFBFBF" w:sz="4"/>
+              <w:bottom w:val="single" w:color="BFBFBF" w:sz="4"/>
+              <w:right w:val="single" w:color="BFBFBF" w:sz="4"/>
+            </w:tcBorders>
+            <w:tcMar>
+              <w:top w:type="dxa" w:w="60"/>
+              <w:left w:type="dxa" w:w="100"/>
+              <w:bottom w:type="dxa" w:w="60"/>
+              <w:right w:type="dxa" w:w="100"/>
+            </w:tcMar>
+            <w:vAlign w:val="center"/>
+          </w:tcPr>
+          <w:p>
+            <w:pPr>
+              <w:keepNext w:val="false"/>
+              <w:spacing w:after="0" w:before="0"/>
+              <w:jc w:val="center"/>
             </w:pPr>
             <w:r>
               <w:rPr>
@@ -1091,24 +1726,26 @@
         </w:tc>
         <w:tc>
           <w:tcPr>
-            <w:tcW w:type="dxa" w:w="812"/>
-            <w:tcBorders>
-              <w:top w:val="single" w:color="BFBFBF" w:sz="4"/>
-              <w:left w:val="single" w:color="BFBFBF" w:sz="4"/>
-              <w:bottom w:val="single" w:color="BFBFBF" w:sz="4"/>
-              <w:right w:val="single" w:color="BFBFBF" w:sz="4"/>
-            </w:tcBorders>
-            <w:tcMar>
-              <w:top w:type="dxa" w:w="60"/>
-              <w:left w:type="dxa" w:w="100"/>
-              <w:bottom w:type="dxa" w:w="60"/>
-              <w:right w:type="dxa" w:w="100"/>
-            </w:tcMar>
-          </w:tcPr>
-          <w:p>
-            <w:pPr>
-              <w:spacing w:after="0" w:before="0"/>
-              <w:jc w:val="right"/>
+            <w:tcW w:type="dxa" w:w="800"/>
+            <w:tcBorders>
+              <w:top w:val="single" w:color="BFBFBF" w:sz="4"/>
+              <w:left w:val="single" w:color="BFBFBF" w:sz="4"/>
+              <w:bottom w:val="single" w:color="BFBFBF" w:sz="4"/>
+              <w:right w:val="single" w:color="BFBFBF" w:sz="4"/>
+            </w:tcBorders>
+            <w:tcMar>
+              <w:top w:type="dxa" w:w="60"/>
+              <w:left w:type="dxa" w:w="100"/>
+              <w:bottom w:type="dxa" w:w="60"/>
+              <w:right w:type="dxa" w:w="100"/>
+            </w:tcMar>
+            <w:vAlign w:val="center"/>
+          </w:tcPr>
+          <w:p>
+            <w:pPr>
+              <w:keepNext w:val="false"/>
+              <w:spacing w:after="0" w:before="0"/>
+              <w:jc w:val="center"/>
             </w:pPr>
             <w:r>
               <w:rPr>
@@ -1511,21 +2148,22 @@
         </w:tblBorders>
       </w:tblPr>
       <w:tblGrid>
-        <w:gridCol w:w="3442"/>
-        <w:gridCol w:w="806"/>
-        <w:gridCol w:w="806"/>
-        <w:gridCol w:w="806"/>
-        <w:gridCol w:w="806"/>
-        <w:gridCol w:w="1613"/>
-        <w:gridCol w:w="1081"/>
+        <w:gridCol w:w="2560"/>
+        <w:gridCol w:w="900"/>
+        <w:gridCol w:w="900"/>
+        <w:gridCol w:w="800"/>
+        <w:gridCol w:w="900"/>
+        <w:gridCol w:w="1700"/>
+        <w:gridCol w:w="1600"/>
       </w:tblGrid>
       <w:tr>
         <w:trPr>
+          <w:cantSplit/>
           <w:tblHeader/>
         </w:trPr>
         <w:tc>
           <w:tcPr>
-            <w:tcW w:type="dxa" w:w="3442"/>
+            <w:tcW w:type="dxa" w:w="2560"/>
             <w:tcBorders>
               <w:top w:val="single" w:color="BFBFBF" w:sz="4"/>
               <w:left w:val="single" w:color="BFBFBF" w:sz="4"/>
@@ -1539,9 +2177,11 @@
               <w:bottom w:type="dxa" w:w="60"/>
               <w:right w:type="dxa" w:w="100"/>
             </w:tcMar>
-          </w:tcPr>
-          <w:p>
-            <w:pPr>
+            <w:vAlign w:val="center"/>
+          </w:tcPr>
+          <w:p>
+            <w:pPr>
+              <w:keepNext/>
               <w:spacing w:after="0" w:before="0"/>
               <w:jc w:val="left"/>
             </w:pPr>
@@ -1559,7 +2199,7 @@
         </w:tc>
         <w:tc>
           <w:tcPr>
-            <w:tcW w:type="dxa" w:w="806"/>
+            <w:tcW w:type="dxa" w:w="900"/>
             <w:tcBorders>
               <w:top w:val="single" w:color="BFBFBF" w:sz="4"/>
               <w:left w:val="single" w:color="BFBFBF" w:sz="4"/>
@@ -1573,9 +2213,11 @@
               <w:bottom w:type="dxa" w:w="60"/>
               <w:right w:type="dxa" w:w="100"/>
             </w:tcMar>
-          </w:tcPr>
-          <w:p>
-            <w:pPr>
+            <w:vAlign w:val="center"/>
+          </w:tcPr>
+          <w:p>
+            <w:pPr>
+              <w:keepNext/>
               <w:spacing w:after="0" w:before="0"/>
               <w:jc w:val="left"/>
             </w:pPr>
@@ -1593,7 +2235,7 @@
         </w:tc>
         <w:tc>
           <w:tcPr>
-            <w:tcW w:type="dxa" w:w="806"/>
+            <w:tcW w:type="dxa" w:w="900"/>
             <w:tcBorders>
               <w:top w:val="single" w:color="BFBFBF" w:sz="4"/>
               <w:left w:val="single" w:color="BFBFBF" w:sz="4"/>
@@ -1607,9 +2249,11 @@
               <w:bottom w:type="dxa" w:w="60"/>
               <w:right w:type="dxa" w:w="100"/>
             </w:tcMar>
-          </w:tcPr>
-          <w:p>
-            <w:pPr>
+            <w:vAlign w:val="center"/>
+          </w:tcPr>
+          <w:p>
+            <w:pPr>
+              <w:keepNext/>
               <w:spacing w:after="0" w:before="0"/>
               <w:jc w:val="left"/>
             </w:pPr>
@@ -1627,7 +2271,7 @@
         </w:tc>
         <w:tc>
           <w:tcPr>
-            <w:tcW w:type="dxa" w:w="806"/>
+            <w:tcW w:type="dxa" w:w="800"/>
             <w:tcBorders>
               <w:top w:val="single" w:color="BFBFBF" w:sz="4"/>
               <w:left w:val="single" w:color="BFBFBF" w:sz="4"/>
@@ -1641,9 +2285,11 @@
               <w:bottom w:type="dxa" w:w="60"/>
               <w:right w:type="dxa" w:w="100"/>
             </w:tcMar>
-          </w:tcPr>
-          <w:p>
-            <w:pPr>
+            <w:vAlign w:val="center"/>
+          </w:tcPr>
+          <w:p>
+            <w:pPr>
+              <w:keepNext/>
               <w:spacing w:after="0" w:before="0"/>
               <w:jc w:val="left"/>
             </w:pPr>
@@ -1661,7 +2307,7 @@
         </w:tc>
         <w:tc>
           <w:tcPr>
-            <w:tcW w:type="dxa" w:w="806"/>
+            <w:tcW w:type="dxa" w:w="900"/>
             <w:tcBorders>
               <w:top w:val="single" w:color="BFBFBF" w:sz="4"/>
               <w:left w:val="single" w:color="BFBFBF" w:sz="4"/>
@@ -1675,9 +2321,11 @@
               <w:bottom w:type="dxa" w:w="60"/>
               <w:right w:type="dxa" w:w="100"/>
             </w:tcMar>
-          </w:tcPr>
-          <w:p>
-            <w:pPr>
+            <w:vAlign w:val="center"/>
+          </w:tcPr>
+          <w:p>
+            <w:pPr>
+              <w:keepNext/>
               <w:spacing w:after="0" w:before="0"/>
               <w:jc w:val="left"/>
             </w:pPr>
@@ -1695,7 +2343,7 @@
         </w:tc>
         <w:tc>
           <w:tcPr>
-            <w:tcW w:type="dxa" w:w="1613"/>
+            <w:tcW w:type="dxa" w:w="1700"/>
             <w:tcBorders>
               <w:top w:val="single" w:color="BFBFBF" w:sz="4"/>
               <w:left w:val="single" w:color="BFBFBF" w:sz="4"/>
@@ -1709,9 +2357,11 @@
               <w:bottom w:type="dxa" w:w="60"/>
               <w:right w:type="dxa" w:w="100"/>
             </w:tcMar>
-          </w:tcPr>
-          <w:p>
-            <w:pPr>
+            <w:vAlign w:val="center"/>
+          </w:tcPr>
+          <w:p>
+            <w:pPr>
+              <w:keepNext/>
               <w:spacing w:after="0" w:before="0"/>
               <w:jc w:val="left"/>
             </w:pPr>
@@ -1729,7 +2379,7 @@
         </w:tc>
         <w:tc>
           <w:tcPr>
-            <w:tcW w:type="dxa" w:w="1081"/>
+            <w:tcW w:type="dxa" w:w="1600"/>
             <w:tcBorders>
               <w:top w:val="single" w:color="BFBFBF" w:sz="4"/>
               <w:left w:val="single" w:color="BFBFBF" w:sz="4"/>
@@ -1743,9 +2393,11 @@
               <w:bottom w:type="dxa" w:w="60"/>
               <w:right w:type="dxa" w:w="100"/>
             </w:tcMar>
-          </w:tcPr>
-          <w:p>
-            <w:pPr>
+            <w:vAlign w:val="center"/>
+          </w:tcPr>
+          <w:p>
+            <w:pPr>
+              <w:keepNext/>
               <w:spacing w:after="0" w:before="0"/>
               <w:jc w:val="left"/>
             </w:pPr>
@@ -1764,26 +2416,29 @@
       </w:tr>
       <w:tr>
         <w:trPr>
+          <w:cantSplit/>
           <w:tblHeader w:val="false"/>
         </w:trPr>
         <w:tc>
           <w:tcPr>
-            <w:tcW w:type="dxa" w:w="3442"/>
-            <w:tcBorders>
-              <w:top w:val="single" w:color="BFBFBF" w:sz="4"/>
-              <w:left w:val="single" w:color="BFBFBF" w:sz="4"/>
-              <w:bottom w:val="single" w:color="BFBFBF" w:sz="4"/>
-              <w:right w:val="single" w:color="BFBFBF" w:sz="4"/>
-            </w:tcBorders>
-            <w:tcMar>
-              <w:top w:type="dxa" w:w="60"/>
-              <w:left w:type="dxa" w:w="100"/>
-              <w:bottom w:type="dxa" w:w="60"/>
-              <w:right w:type="dxa" w:w="100"/>
-            </w:tcMar>
-          </w:tcPr>
-          <w:p>
-            <w:pPr>
+            <w:tcW w:type="dxa" w:w="2560"/>
+            <w:tcBorders>
+              <w:top w:val="single" w:color="BFBFBF" w:sz="4"/>
+              <w:left w:val="single" w:color="BFBFBF" w:sz="4"/>
+              <w:bottom w:val="single" w:color="BFBFBF" w:sz="4"/>
+              <w:right w:val="single" w:color="BFBFBF" w:sz="4"/>
+            </w:tcBorders>
+            <w:tcMar>
+              <w:top w:type="dxa" w:w="60"/>
+              <w:left w:type="dxa" w:w="100"/>
+              <w:bottom w:type="dxa" w:w="60"/>
+              <w:right w:type="dxa" w:w="100"/>
+            </w:tcMar>
+            <w:vAlign w:val="center"/>
+          </w:tcPr>
+          <w:p>
+            <w:pPr>
+              <w:keepNext/>
               <w:spacing w:after="0" w:before="0"/>
               <w:jc w:val="left"/>
             </w:pPr>
@@ -1800,24 +2455,26 @@
         </w:tc>
         <w:tc>
           <w:tcPr>
-            <w:tcW w:type="dxa" w:w="806"/>
-            <w:tcBorders>
-              <w:top w:val="single" w:color="BFBFBF" w:sz="4"/>
-              <w:left w:val="single" w:color="BFBFBF" w:sz="4"/>
-              <w:bottom w:val="single" w:color="BFBFBF" w:sz="4"/>
-              <w:right w:val="single" w:color="BFBFBF" w:sz="4"/>
-            </w:tcBorders>
-            <w:tcMar>
-              <w:top w:type="dxa" w:w="60"/>
-              <w:left w:type="dxa" w:w="100"/>
-              <w:bottom w:type="dxa" w:w="60"/>
-              <w:right w:type="dxa" w:w="100"/>
-            </w:tcMar>
-          </w:tcPr>
-          <w:p>
-            <w:pPr>
-              <w:spacing w:after="0" w:before="0"/>
-              <w:jc w:val="right"/>
+            <w:tcW w:type="dxa" w:w="900"/>
+            <w:tcBorders>
+              <w:top w:val="single" w:color="BFBFBF" w:sz="4"/>
+              <w:left w:val="single" w:color="BFBFBF" w:sz="4"/>
+              <w:bottom w:val="single" w:color="BFBFBF" w:sz="4"/>
+              <w:right w:val="single" w:color="BFBFBF" w:sz="4"/>
+            </w:tcBorders>
+            <w:tcMar>
+              <w:top w:type="dxa" w:w="60"/>
+              <w:left w:type="dxa" w:w="100"/>
+              <w:bottom w:type="dxa" w:w="60"/>
+              <w:right w:type="dxa" w:w="100"/>
+            </w:tcMar>
+            <w:vAlign w:val="center"/>
+          </w:tcPr>
+          <w:p>
+            <w:pPr>
+              <w:keepNext/>
+              <w:spacing w:after="0" w:before="0"/>
+              <w:jc w:val="center"/>
             </w:pPr>
             <w:r>
               <w:rPr>
@@ -1832,24 +2489,26 @@
         </w:tc>
         <w:tc>
           <w:tcPr>
-            <w:tcW w:type="dxa" w:w="806"/>
-            <w:tcBorders>
-              <w:top w:val="single" w:color="BFBFBF" w:sz="4"/>
-              <w:left w:val="single" w:color="BFBFBF" w:sz="4"/>
-              <w:bottom w:val="single" w:color="BFBFBF" w:sz="4"/>
-              <w:right w:val="single" w:color="BFBFBF" w:sz="4"/>
-            </w:tcBorders>
-            <w:tcMar>
-              <w:top w:type="dxa" w:w="60"/>
-              <w:left w:type="dxa" w:w="100"/>
-              <w:bottom w:type="dxa" w:w="60"/>
-              <w:right w:type="dxa" w:w="100"/>
-            </w:tcMar>
-          </w:tcPr>
-          <w:p>
-            <w:pPr>
-              <w:spacing w:after="0" w:before="0"/>
-              <w:jc w:val="right"/>
+            <w:tcW w:type="dxa" w:w="900"/>
+            <w:tcBorders>
+              <w:top w:val="single" w:color="BFBFBF" w:sz="4"/>
+              <w:left w:val="single" w:color="BFBFBF" w:sz="4"/>
+              <w:bottom w:val="single" w:color="BFBFBF" w:sz="4"/>
+              <w:right w:val="single" w:color="BFBFBF" w:sz="4"/>
+            </w:tcBorders>
+            <w:tcMar>
+              <w:top w:type="dxa" w:w="60"/>
+              <w:left w:type="dxa" w:w="100"/>
+              <w:bottom w:type="dxa" w:w="60"/>
+              <w:right w:type="dxa" w:w="100"/>
+            </w:tcMar>
+            <w:vAlign w:val="center"/>
+          </w:tcPr>
+          <w:p>
+            <w:pPr>
+              <w:keepNext/>
+              <w:spacing w:after="0" w:before="0"/>
+              <w:jc w:val="center"/>
             </w:pPr>
             <w:r>
               <w:rPr>
@@ -1864,24 +2523,26 @@
         </w:tc>
         <w:tc>
           <w:tcPr>
-            <w:tcW w:type="dxa" w:w="806"/>
-            <w:tcBorders>
-              <w:top w:val="single" w:color="BFBFBF" w:sz="4"/>
-              <w:left w:val="single" w:color="BFBFBF" w:sz="4"/>
-              <w:bottom w:val="single" w:color="BFBFBF" w:sz="4"/>
-              <w:right w:val="single" w:color="BFBFBF" w:sz="4"/>
-            </w:tcBorders>
-            <w:tcMar>
-              <w:top w:type="dxa" w:w="60"/>
-              <w:left w:type="dxa" w:w="100"/>
-              <w:bottom w:type="dxa" w:w="60"/>
-              <w:right w:type="dxa" w:w="100"/>
-            </w:tcMar>
-          </w:tcPr>
-          <w:p>
-            <w:pPr>
-              <w:spacing w:after="0" w:before="0"/>
-              <w:jc w:val="right"/>
+            <w:tcW w:type="dxa" w:w="800"/>
+            <w:tcBorders>
+              <w:top w:val="single" w:color="BFBFBF" w:sz="4"/>
+              <w:left w:val="single" w:color="BFBFBF" w:sz="4"/>
+              <w:bottom w:val="single" w:color="BFBFBF" w:sz="4"/>
+              <w:right w:val="single" w:color="BFBFBF" w:sz="4"/>
+            </w:tcBorders>
+            <w:tcMar>
+              <w:top w:type="dxa" w:w="60"/>
+              <w:left w:type="dxa" w:w="100"/>
+              <w:bottom w:type="dxa" w:w="60"/>
+              <w:right w:type="dxa" w:w="100"/>
+            </w:tcMar>
+            <w:vAlign w:val="center"/>
+          </w:tcPr>
+          <w:p>
+            <w:pPr>
+              <w:keepNext/>
+              <w:spacing w:after="0" w:before="0"/>
+              <w:jc w:val="center"/>
             </w:pPr>
             <w:r>
               <w:rPr>
@@ -1896,24 +2557,26 @@
         </w:tc>
         <w:tc>
           <w:tcPr>
-            <w:tcW w:type="dxa" w:w="806"/>
-            <w:tcBorders>
-              <w:top w:val="single" w:color="BFBFBF" w:sz="4"/>
-              <w:left w:val="single" w:color="BFBFBF" w:sz="4"/>
-              <w:bottom w:val="single" w:color="BFBFBF" w:sz="4"/>
-              <w:right w:val="single" w:color="BFBFBF" w:sz="4"/>
-            </w:tcBorders>
-            <w:tcMar>
-              <w:top w:type="dxa" w:w="60"/>
-              <w:left w:type="dxa" w:w="100"/>
-              <w:bottom w:type="dxa" w:w="60"/>
-              <w:right w:type="dxa" w:w="100"/>
-            </w:tcMar>
-          </w:tcPr>
-          <w:p>
-            <w:pPr>
-              <w:spacing w:after="0" w:before="0"/>
-              <w:jc w:val="right"/>
+            <w:tcW w:type="dxa" w:w="900"/>
+            <w:tcBorders>
+              <w:top w:val="single" w:color="BFBFBF" w:sz="4"/>
+              <w:left w:val="single" w:color="BFBFBF" w:sz="4"/>
+              <w:bottom w:val="single" w:color="BFBFBF" w:sz="4"/>
+              <w:right w:val="single" w:color="BFBFBF" w:sz="4"/>
+            </w:tcBorders>
+            <w:tcMar>
+              <w:top w:type="dxa" w:w="60"/>
+              <w:left w:type="dxa" w:w="100"/>
+              <w:bottom w:type="dxa" w:w="60"/>
+              <w:right w:type="dxa" w:w="100"/>
+            </w:tcMar>
+            <w:vAlign w:val="center"/>
+          </w:tcPr>
+          <w:p>
+            <w:pPr>
+              <w:keepNext/>
+              <w:spacing w:after="0" w:before="0"/>
+              <w:jc w:val="center"/>
             </w:pPr>
             <w:r>
               <w:rPr>
@@ -1928,24 +2591,26 @@
         </w:tc>
         <w:tc>
           <w:tcPr>
-            <w:tcW w:type="dxa" w:w="1613"/>
-            <w:tcBorders>
-              <w:top w:val="single" w:color="BFBFBF" w:sz="4"/>
-              <w:left w:val="single" w:color="BFBFBF" w:sz="4"/>
-              <w:bottom w:val="single" w:color="BFBFBF" w:sz="4"/>
-              <w:right w:val="single" w:color="BFBFBF" w:sz="4"/>
-            </w:tcBorders>
-            <w:tcMar>
-              <w:top w:type="dxa" w:w="60"/>
-              <w:left w:type="dxa" w:w="100"/>
-              <w:bottom w:type="dxa" w:w="60"/>
-              <w:right w:type="dxa" w:w="100"/>
-            </w:tcMar>
-          </w:tcPr>
-          <w:p>
-            <w:pPr>
-              <w:spacing w:after="0" w:before="0"/>
-              <w:jc w:val="right"/>
+            <w:tcW w:type="dxa" w:w="1700"/>
+            <w:tcBorders>
+              <w:top w:val="single" w:color="BFBFBF" w:sz="4"/>
+              <w:left w:val="single" w:color="BFBFBF" w:sz="4"/>
+              <w:bottom w:val="single" w:color="BFBFBF" w:sz="4"/>
+              <w:right w:val="single" w:color="BFBFBF" w:sz="4"/>
+            </w:tcBorders>
+            <w:tcMar>
+              <w:top w:type="dxa" w:w="60"/>
+              <w:left w:type="dxa" w:w="100"/>
+              <w:bottom w:type="dxa" w:w="60"/>
+              <w:right w:type="dxa" w:w="100"/>
+            </w:tcMar>
+            <w:vAlign w:val="center"/>
+          </w:tcPr>
+          <w:p>
+            <w:pPr>
+              <w:keepNext/>
+              <w:spacing w:after="0" w:before="0"/>
+              <w:jc w:val="center"/>
             </w:pPr>
             <w:r>
               <w:rPr>
@@ -1960,24 +2625,26 @@
         </w:tc>
         <w:tc>
           <w:tcPr>
-            <w:tcW w:type="dxa" w:w="1081"/>
-            <w:tcBorders>
-              <w:top w:val="single" w:color="BFBFBF" w:sz="4"/>
-              <w:left w:val="single" w:color="BFBFBF" w:sz="4"/>
-              <w:bottom w:val="single" w:color="BFBFBF" w:sz="4"/>
-              <w:right w:val="single" w:color="BFBFBF" w:sz="4"/>
-            </w:tcBorders>
-            <w:tcMar>
-              <w:top w:type="dxa" w:w="60"/>
-              <w:left w:type="dxa" w:w="100"/>
-              <w:bottom w:type="dxa" w:w="60"/>
-              <w:right w:type="dxa" w:w="100"/>
-            </w:tcMar>
-          </w:tcPr>
-          <w:p>
-            <w:pPr>
-              <w:spacing w:after="0" w:before="0"/>
-              <w:jc w:val="right"/>
+            <w:tcW w:type="dxa" w:w="1600"/>
+            <w:tcBorders>
+              <w:top w:val="single" w:color="BFBFBF" w:sz="4"/>
+              <w:left w:val="single" w:color="BFBFBF" w:sz="4"/>
+              <w:bottom w:val="single" w:color="BFBFBF" w:sz="4"/>
+              <w:right w:val="single" w:color="BFBFBF" w:sz="4"/>
+            </w:tcBorders>
+            <w:tcMar>
+              <w:top w:type="dxa" w:w="60"/>
+              <w:left w:type="dxa" w:w="100"/>
+              <w:bottom w:type="dxa" w:w="60"/>
+              <w:right w:type="dxa" w:w="100"/>
+            </w:tcMar>
+            <w:vAlign w:val="center"/>
+          </w:tcPr>
+          <w:p>
+            <w:pPr>
+              <w:keepNext/>
+              <w:spacing w:after="0" w:before="0"/>
+              <w:jc w:val="center"/>
             </w:pPr>
             <w:r>
               <w:rPr>
@@ -1993,11 +2660,12 @@
       </w:tr>
       <w:tr>
         <w:trPr>
+          <w:cantSplit/>
           <w:tblHeader w:val="false"/>
         </w:trPr>
         <w:tc>
           <w:tcPr>
-            <w:tcW w:type="dxa" w:w="3442"/>
+            <w:tcW w:type="dxa" w:w="2560"/>
             <w:tcBorders>
               <w:top w:val="single" w:color="BFBFBF" w:sz="4"/>
               <w:left w:val="single" w:color="BFBFBF" w:sz="4"/>
@@ -2011,9 +2679,11 @@
               <w:bottom w:type="dxa" w:w="60"/>
               <w:right w:type="dxa" w:w="100"/>
             </w:tcMar>
-          </w:tcPr>
-          <w:p>
-            <w:pPr>
+            <w:vAlign w:val="center"/>
+          </w:tcPr>
+          <w:p>
+            <w:pPr>
+              <w:keepNext/>
               <w:spacing w:after="0" w:before="0"/>
               <w:jc w:val="left"/>
             </w:pPr>
@@ -2028,7 +2698,7 @@
         </w:tc>
         <w:tc>
           <w:tcPr>
-            <w:tcW w:type="dxa" w:w="806"/>
+            <w:tcW w:type="dxa" w:w="900"/>
             <w:tcBorders>
               <w:top w:val="single" w:color="BFBFBF" w:sz="4"/>
               <w:left w:val="single" w:color="BFBFBF" w:sz="4"/>
@@ -2042,11 +2712,13 @@
               <w:bottom w:type="dxa" w:w="60"/>
               <w:right w:type="dxa" w:w="100"/>
             </w:tcMar>
-          </w:tcPr>
-          <w:p>
-            <w:pPr>
-              <w:spacing w:after="0" w:before="0"/>
-              <w:jc w:val="right"/>
+            <w:vAlign w:val="center"/>
+          </w:tcPr>
+          <w:p>
+            <w:pPr>
+              <w:keepNext/>
+              <w:spacing w:after="0" w:before="0"/>
+              <w:jc w:val="center"/>
             </w:pPr>
             <w:r>
               <w:rPr>
@@ -2059,7 +2731,7 @@
         </w:tc>
         <w:tc>
           <w:tcPr>
-            <w:tcW w:type="dxa" w:w="806"/>
+            <w:tcW w:type="dxa" w:w="900"/>
             <w:tcBorders>
               <w:top w:val="single" w:color="BFBFBF" w:sz="4"/>
               <w:left w:val="single" w:color="BFBFBF" w:sz="4"/>
@@ -2073,11 +2745,13 @@
               <w:bottom w:type="dxa" w:w="60"/>
               <w:right w:type="dxa" w:w="100"/>
             </w:tcMar>
-          </w:tcPr>
-          <w:p>
-            <w:pPr>
-              <w:spacing w:after="0" w:before="0"/>
-              <w:jc w:val="right"/>
+            <w:vAlign w:val="center"/>
+          </w:tcPr>
+          <w:p>
+            <w:pPr>
+              <w:keepNext/>
+              <w:spacing w:after="0" w:before="0"/>
+              <w:jc w:val="center"/>
             </w:pPr>
             <w:r>
               <w:rPr>
@@ -2090,7 +2764,7 @@
         </w:tc>
         <w:tc>
           <w:tcPr>
-            <w:tcW w:type="dxa" w:w="806"/>
+            <w:tcW w:type="dxa" w:w="800"/>
             <w:tcBorders>
               <w:top w:val="single" w:color="BFBFBF" w:sz="4"/>
               <w:left w:val="single" w:color="BFBFBF" w:sz="4"/>
@@ -2104,11 +2778,13 @@
               <w:bottom w:type="dxa" w:w="60"/>
               <w:right w:type="dxa" w:w="100"/>
             </w:tcMar>
-          </w:tcPr>
-          <w:p>
-            <w:pPr>
-              <w:spacing w:after="0" w:before="0"/>
-              <w:jc w:val="right"/>
+            <w:vAlign w:val="center"/>
+          </w:tcPr>
+          <w:p>
+            <w:pPr>
+              <w:keepNext/>
+              <w:spacing w:after="0" w:before="0"/>
+              <w:jc w:val="center"/>
             </w:pPr>
             <w:r>
               <w:rPr>
@@ -2121,7 +2797,7 @@
         </w:tc>
         <w:tc>
           <w:tcPr>
-            <w:tcW w:type="dxa" w:w="806"/>
+            <w:tcW w:type="dxa" w:w="900"/>
             <w:tcBorders>
               <w:top w:val="single" w:color="BFBFBF" w:sz="4"/>
               <w:left w:val="single" w:color="BFBFBF" w:sz="4"/>
@@ -2135,11 +2811,13 @@
               <w:bottom w:type="dxa" w:w="60"/>
               <w:right w:type="dxa" w:w="100"/>
             </w:tcMar>
-          </w:tcPr>
-          <w:p>
-            <w:pPr>
-              <w:spacing w:after="0" w:before="0"/>
-              <w:jc w:val="right"/>
+            <w:vAlign w:val="center"/>
+          </w:tcPr>
+          <w:p>
+            <w:pPr>
+              <w:keepNext/>
+              <w:spacing w:after="0" w:before="0"/>
+              <w:jc w:val="center"/>
             </w:pPr>
             <w:r>
               <w:rPr>
@@ -2152,7 +2830,7 @@
         </w:tc>
         <w:tc>
           <w:tcPr>
-            <w:tcW w:type="dxa" w:w="1613"/>
+            <w:tcW w:type="dxa" w:w="1700"/>
             <w:tcBorders>
               <w:top w:val="single" w:color="BFBFBF" w:sz="4"/>
               <w:left w:val="single" w:color="BFBFBF" w:sz="4"/>
@@ -2166,11 +2844,13 @@
               <w:bottom w:type="dxa" w:w="60"/>
               <w:right w:type="dxa" w:w="100"/>
             </w:tcMar>
-          </w:tcPr>
-          <w:p>
-            <w:pPr>
-              <w:spacing w:after="0" w:before="0"/>
-              <w:jc w:val="right"/>
+            <w:vAlign w:val="center"/>
+          </w:tcPr>
+          <w:p>
+            <w:pPr>
+              <w:keepNext/>
+              <w:spacing w:after="0" w:before="0"/>
+              <w:jc w:val="center"/>
             </w:pPr>
             <w:r>
               <w:rPr>
@@ -2183,7 +2863,7 @@
         </w:tc>
         <w:tc>
           <w:tcPr>
-            <w:tcW w:type="dxa" w:w="1081"/>
+            <w:tcW w:type="dxa" w:w="1600"/>
             <w:tcBorders>
               <w:top w:val="single" w:color="BFBFBF" w:sz="4"/>
               <w:left w:val="single" w:color="BFBFBF" w:sz="4"/>
@@ -2197,11 +2877,13 @@
               <w:bottom w:type="dxa" w:w="60"/>
               <w:right w:type="dxa" w:w="100"/>
             </w:tcMar>
-          </w:tcPr>
-          <w:p>
-            <w:pPr>
-              <w:spacing w:after="0" w:before="0"/>
-              <w:jc w:val="right"/>
+            <w:vAlign w:val="center"/>
+          </w:tcPr>
+          <w:p>
+            <w:pPr>
+              <w:keepNext/>
+              <w:spacing w:after="0" w:before="0"/>
+              <w:jc w:val="center"/>
             </w:pPr>
             <w:r>
               <w:rPr>
@@ -2215,26 +2897,29 @@
       </w:tr>
       <w:tr>
         <w:trPr>
+          <w:cantSplit/>
           <w:tblHeader w:val="false"/>
         </w:trPr>
         <w:tc>
           <w:tcPr>
-            <w:tcW w:type="dxa" w:w="3442"/>
-            <w:tcBorders>
-              <w:top w:val="single" w:color="BFBFBF" w:sz="4"/>
-              <w:left w:val="single" w:color="BFBFBF" w:sz="4"/>
-              <w:bottom w:val="single" w:color="BFBFBF" w:sz="4"/>
-              <w:right w:val="single" w:color="BFBFBF" w:sz="4"/>
-            </w:tcBorders>
-            <w:tcMar>
-              <w:top w:type="dxa" w:w="60"/>
-              <w:left w:type="dxa" w:w="100"/>
-              <w:bottom w:type="dxa" w:w="60"/>
-              <w:right w:type="dxa" w:w="100"/>
-            </w:tcMar>
-          </w:tcPr>
-          <w:p>
-            <w:pPr>
+            <w:tcW w:type="dxa" w:w="2560"/>
+            <w:tcBorders>
+              <w:top w:val="single" w:color="BFBFBF" w:sz="4"/>
+              <w:left w:val="single" w:color="BFBFBF" w:sz="4"/>
+              <w:bottom w:val="single" w:color="BFBFBF" w:sz="4"/>
+              <w:right w:val="single" w:color="BFBFBF" w:sz="4"/>
+            </w:tcBorders>
+            <w:tcMar>
+              <w:top w:type="dxa" w:w="60"/>
+              <w:left w:type="dxa" w:w="100"/>
+              <w:bottom w:type="dxa" w:w="60"/>
+              <w:right w:type="dxa" w:w="100"/>
+            </w:tcMar>
+            <w:vAlign w:val="center"/>
+          </w:tcPr>
+          <w:p>
+            <w:pPr>
+              <w:keepNext/>
               <w:spacing w:after="0" w:before="0"/>
               <w:jc w:val="left"/>
             </w:pPr>
@@ -2249,24 +2934,26 @@
         </w:tc>
         <w:tc>
           <w:tcPr>
-            <w:tcW w:type="dxa" w:w="806"/>
-            <w:tcBorders>
-              <w:top w:val="single" w:color="BFBFBF" w:sz="4"/>
-              <w:left w:val="single" w:color="BFBFBF" w:sz="4"/>
-              <w:bottom w:val="single" w:color="BFBFBF" w:sz="4"/>
-              <w:right w:val="single" w:color="BFBFBF" w:sz="4"/>
-            </w:tcBorders>
-            <w:tcMar>
-              <w:top w:type="dxa" w:w="60"/>
-              <w:left w:type="dxa" w:w="100"/>
-              <w:bottom w:type="dxa" w:w="60"/>
-              <w:right w:type="dxa" w:w="100"/>
-            </w:tcMar>
-          </w:tcPr>
-          <w:p>
-            <w:pPr>
-              <w:spacing w:after="0" w:before="0"/>
-              <w:jc w:val="right"/>
+            <w:tcW w:type="dxa" w:w="900"/>
+            <w:tcBorders>
+              <w:top w:val="single" w:color="BFBFBF" w:sz="4"/>
+              <w:left w:val="single" w:color="BFBFBF" w:sz="4"/>
+              <w:bottom w:val="single" w:color="BFBFBF" w:sz="4"/>
+              <w:right w:val="single" w:color="BFBFBF" w:sz="4"/>
+            </w:tcBorders>
+            <w:tcMar>
+              <w:top w:type="dxa" w:w="60"/>
+              <w:left w:type="dxa" w:w="100"/>
+              <w:bottom w:type="dxa" w:w="60"/>
+              <w:right w:type="dxa" w:w="100"/>
+            </w:tcMar>
+            <w:vAlign w:val="center"/>
+          </w:tcPr>
+          <w:p>
+            <w:pPr>
+              <w:keepNext/>
+              <w:spacing w:after="0" w:before="0"/>
+              <w:jc w:val="center"/>
             </w:pPr>
             <w:r>
               <w:rPr>
@@ -2279,24 +2966,26 @@
         </w:tc>
         <w:tc>
           <w:tcPr>
-            <w:tcW w:type="dxa" w:w="806"/>
-            <w:tcBorders>
-              <w:top w:val="single" w:color="BFBFBF" w:sz="4"/>
-              <w:left w:val="single" w:color="BFBFBF" w:sz="4"/>
-              <w:bottom w:val="single" w:color="BFBFBF" w:sz="4"/>
-              <w:right w:val="single" w:color="BFBFBF" w:sz="4"/>
-            </w:tcBorders>
-            <w:tcMar>
-              <w:top w:type="dxa" w:w="60"/>
-              <w:left w:type="dxa" w:w="100"/>
-              <w:bottom w:type="dxa" w:w="60"/>
-              <w:right w:type="dxa" w:w="100"/>
-            </w:tcMar>
-          </w:tcPr>
-          <w:p>
-            <w:pPr>
-              <w:spacing w:after="0" w:before="0"/>
-              <w:jc w:val="right"/>
+            <w:tcW w:type="dxa" w:w="900"/>
+            <w:tcBorders>
+              <w:top w:val="single" w:color="BFBFBF" w:sz="4"/>
+              <w:left w:val="single" w:color="BFBFBF" w:sz="4"/>
+              <w:bottom w:val="single" w:color="BFBFBF" w:sz="4"/>
+              <w:right w:val="single" w:color="BFBFBF" w:sz="4"/>
+            </w:tcBorders>
+            <w:tcMar>
+              <w:top w:type="dxa" w:w="60"/>
+              <w:left w:type="dxa" w:w="100"/>
+              <w:bottom w:type="dxa" w:w="60"/>
+              <w:right w:type="dxa" w:w="100"/>
+            </w:tcMar>
+            <w:vAlign w:val="center"/>
+          </w:tcPr>
+          <w:p>
+            <w:pPr>
+              <w:keepNext/>
+              <w:spacing w:after="0" w:before="0"/>
+              <w:jc w:val="center"/>
             </w:pPr>
             <w:r>
               <w:rPr>
@@ -2309,24 +2998,26 @@
         </w:tc>
         <w:tc>
           <w:tcPr>
-            <w:tcW w:type="dxa" w:w="806"/>
-            <w:tcBorders>
-              <w:top w:val="single" w:color="BFBFBF" w:sz="4"/>
-              <w:left w:val="single" w:color="BFBFBF" w:sz="4"/>
-              <w:bottom w:val="single" w:color="BFBFBF" w:sz="4"/>
-              <w:right w:val="single" w:color="BFBFBF" w:sz="4"/>
-            </w:tcBorders>
-            <w:tcMar>
-              <w:top w:type="dxa" w:w="60"/>
-              <w:left w:type="dxa" w:w="100"/>
-              <w:bottom w:type="dxa" w:w="60"/>
-              <w:right w:type="dxa" w:w="100"/>
-            </w:tcMar>
-          </w:tcPr>
-          <w:p>
-            <w:pPr>
-              <w:spacing w:after="0" w:before="0"/>
-              <w:jc w:val="right"/>
+            <w:tcW w:type="dxa" w:w="800"/>
+            <w:tcBorders>
+              <w:top w:val="single" w:color="BFBFBF" w:sz="4"/>
+              <w:left w:val="single" w:color="BFBFBF" w:sz="4"/>
+              <w:bottom w:val="single" w:color="BFBFBF" w:sz="4"/>
+              <w:right w:val="single" w:color="BFBFBF" w:sz="4"/>
+            </w:tcBorders>
+            <w:tcMar>
+              <w:top w:type="dxa" w:w="60"/>
+              <w:left w:type="dxa" w:w="100"/>
+              <w:bottom w:type="dxa" w:w="60"/>
+              <w:right w:type="dxa" w:w="100"/>
+            </w:tcMar>
+            <w:vAlign w:val="center"/>
+          </w:tcPr>
+          <w:p>
+            <w:pPr>
+              <w:keepNext/>
+              <w:spacing w:after="0" w:before="0"/>
+              <w:jc w:val="center"/>
             </w:pPr>
             <w:r>
               <w:rPr>
@@ -2339,24 +3030,26 @@
         </w:tc>
         <w:tc>
           <w:tcPr>
-            <w:tcW w:type="dxa" w:w="806"/>
-            <w:tcBorders>
-              <w:top w:val="single" w:color="BFBFBF" w:sz="4"/>
-              <w:left w:val="single" w:color="BFBFBF" w:sz="4"/>
-              <w:bottom w:val="single" w:color="BFBFBF" w:sz="4"/>
-              <w:right w:val="single" w:color="BFBFBF" w:sz="4"/>
-            </w:tcBorders>
-            <w:tcMar>
-              <w:top w:type="dxa" w:w="60"/>
-              <w:left w:type="dxa" w:w="100"/>
-              <w:bottom w:type="dxa" w:w="60"/>
-              <w:right w:type="dxa" w:w="100"/>
-            </w:tcMar>
-          </w:tcPr>
-          <w:p>
-            <w:pPr>
-              <w:spacing w:after="0" w:before="0"/>
-              <w:jc w:val="right"/>
+            <w:tcW w:type="dxa" w:w="900"/>
+            <w:tcBorders>
+              <w:top w:val="single" w:color="BFBFBF" w:sz="4"/>
+              <w:left w:val="single" w:color="BFBFBF" w:sz="4"/>
+              <w:bottom w:val="single" w:color="BFBFBF" w:sz="4"/>
+              <w:right w:val="single" w:color="BFBFBF" w:sz="4"/>
+            </w:tcBorders>
+            <w:tcMar>
+              <w:top w:type="dxa" w:w="60"/>
+              <w:left w:type="dxa" w:w="100"/>
+              <w:bottom w:type="dxa" w:w="60"/>
+              <w:right w:type="dxa" w:w="100"/>
+            </w:tcMar>
+            <w:vAlign w:val="center"/>
+          </w:tcPr>
+          <w:p>
+            <w:pPr>
+              <w:keepNext/>
+              <w:spacing w:after="0" w:before="0"/>
+              <w:jc w:val="center"/>
             </w:pPr>
             <w:r>
               <w:rPr>
@@ -2369,24 +3062,26 @@
         </w:tc>
         <w:tc>
           <w:tcPr>
-            <w:tcW w:type="dxa" w:w="1613"/>
-            <w:tcBorders>
-              <w:top w:val="single" w:color="BFBFBF" w:sz="4"/>
-              <w:left w:val="single" w:color="BFBFBF" w:sz="4"/>
-              <w:bottom w:val="single" w:color="BFBFBF" w:sz="4"/>
-              <w:right w:val="single" w:color="BFBFBF" w:sz="4"/>
-            </w:tcBorders>
-            <w:tcMar>
-              <w:top w:type="dxa" w:w="60"/>
-              <w:left w:type="dxa" w:w="100"/>
-              <w:bottom w:type="dxa" w:w="60"/>
-              <w:right w:type="dxa" w:w="100"/>
-            </w:tcMar>
-          </w:tcPr>
-          <w:p>
-            <w:pPr>
-              <w:spacing w:after="0" w:before="0"/>
-              <w:jc w:val="right"/>
+            <w:tcW w:type="dxa" w:w="1700"/>
+            <w:tcBorders>
+              <w:top w:val="single" w:color="BFBFBF" w:sz="4"/>
+              <w:left w:val="single" w:color="BFBFBF" w:sz="4"/>
+              <w:bottom w:val="single" w:color="BFBFBF" w:sz="4"/>
+              <w:right w:val="single" w:color="BFBFBF" w:sz="4"/>
+            </w:tcBorders>
+            <w:tcMar>
+              <w:top w:type="dxa" w:w="60"/>
+              <w:left w:type="dxa" w:w="100"/>
+              <w:bottom w:type="dxa" w:w="60"/>
+              <w:right w:type="dxa" w:w="100"/>
+            </w:tcMar>
+            <w:vAlign w:val="center"/>
+          </w:tcPr>
+          <w:p>
+            <w:pPr>
+              <w:keepNext/>
+              <w:spacing w:after="0" w:before="0"/>
+              <w:jc w:val="center"/>
             </w:pPr>
             <w:r>
               <w:rPr>
@@ -2399,24 +3094,26 @@
         </w:tc>
         <w:tc>
           <w:tcPr>
-            <w:tcW w:type="dxa" w:w="1081"/>
-            <w:tcBorders>
-              <w:top w:val="single" w:color="BFBFBF" w:sz="4"/>
-              <w:left w:val="single" w:color="BFBFBF" w:sz="4"/>
-              <w:bottom w:val="single" w:color="BFBFBF" w:sz="4"/>
-              <w:right w:val="single" w:color="BFBFBF" w:sz="4"/>
-            </w:tcBorders>
-            <w:tcMar>
-              <w:top w:type="dxa" w:w="60"/>
-              <w:left w:type="dxa" w:w="100"/>
-              <w:bottom w:type="dxa" w:w="60"/>
-              <w:right w:type="dxa" w:w="100"/>
-            </w:tcMar>
-          </w:tcPr>
-          <w:p>
-            <w:pPr>
-              <w:spacing w:after="0" w:before="0"/>
-              <w:jc w:val="right"/>
+            <w:tcW w:type="dxa" w:w="1600"/>
+            <w:tcBorders>
+              <w:top w:val="single" w:color="BFBFBF" w:sz="4"/>
+              <w:left w:val="single" w:color="BFBFBF" w:sz="4"/>
+              <w:bottom w:val="single" w:color="BFBFBF" w:sz="4"/>
+              <w:right w:val="single" w:color="BFBFBF" w:sz="4"/>
+            </w:tcBorders>
+            <w:tcMar>
+              <w:top w:type="dxa" w:w="60"/>
+              <w:left w:type="dxa" w:w="100"/>
+              <w:bottom w:type="dxa" w:w="60"/>
+              <w:right w:type="dxa" w:w="100"/>
+            </w:tcMar>
+            <w:vAlign w:val="center"/>
+          </w:tcPr>
+          <w:p>
+            <w:pPr>
+              <w:keepNext/>
+              <w:spacing w:after="0" w:before="0"/>
+              <w:jc w:val="center"/>
             </w:pPr>
             <w:r>
               <w:rPr>
@@ -2430,11 +3127,12 @@
       </w:tr>
       <w:tr>
         <w:trPr>
+          <w:cantSplit/>
           <w:tblHeader w:val="false"/>
         </w:trPr>
         <w:tc>
           <w:tcPr>
-            <w:tcW w:type="dxa" w:w="3442"/>
+            <w:tcW w:type="dxa" w:w="2560"/>
             <w:tcBorders>
               <w:top w:val="single" w:color="BFBFBF" w:sz="4"/>
               <w:left w:val="single" w:color="BFBFBF" w:sz="4"/>
@@ -2448,9 +3146,11 @@
               <w:bottom w:type="dxa" w:w="60"/>
               <w:right w:type="dxa" w:w="100"/>
             </w:tcMar>
-          </w:tcPr>
-          <w:p>
-            <w:pPr>
+            <w:vAlign w:val="center"/>
+          </w:tcPr>
+          <w:p>
+            <w:pPr>
+              <w:keepNext/>
               <w:spacing w:after="0" w:before="0"/>
               <w:jc w:val="left"/>
             </w:pPr>
@@ -2465,7 +3165,7 @@
         </w:tc>
         <w:tc>
           <w:tcPr>
-            <w:tcW w:type="dxa" w:w="806"/>
+            <w:tcW w:type="dxa" w:w="900"/>
             <w:tcBorders>
               <w:top w:val="single" w:color="BFBFBF" w:sz="4"/>
               <w:left w:val="single" w:color="BFBFBF" w:sz="4"/>
@@ -2479,11 +3179,13 @@
               <w:bottom w:type="dxa" w:w="60"/>
               <w:right w:type="dxa" w:w="100"/>
             </w:tcMar>
-          </w:tcPr>
-          <w:p>
-            <w:pPr>
-              <w:spacing w:after="0" w:before="0"/>
-              <w:jc w:val="right"/>
+            <w:vAlign w:val="center"/>
+          </w:tcPr>
+          <w:p>
+            <w:pPr>
+              <w:keepNext/>
+              <w:spacing w:after="0" w:before="0"/>
+              <w:jc w:val="center"/>
             </w:pPr>
             <w:r>
               <w:rPr>
@@ -2496,7 +3198,7 @@
         </w:tc>
         <w:tc>
           <w:tcPr>
-            <w:tcW w:type="dxa" w:w="806"/>
+            <w:tcW w:type="dxa" w:w="900"/>
             <w:tcBorders>
               <w:top w:val="single" w:color="BFBFBF" w:sz="4"/>
               <w:left w:val="single" w:color="BFBFBF" w:sz="4"/>
@@ -2510,11 +3212,13 @@
               <w:bottom w:type="dxa" w:w="60"/>
               <w:right w:type="dxa" w:w="100"/>
             </w:tcMar>
-          </w:tcPr>
-          <w:p>
-            <w:pPr>
-              <w:spacing w:after="0" w:before="0"/>
-              <w:jc w:val="right"/>
+            <w:vAlign w:val="center"/>
+          </w:tcPr>
+          <w:p>
+            <w:pPr>
+              <w:keepNext/>
+              <w:spacing w:after="0" w:before="0"/>
+              <w:jc w:val="center"/>
             </w:pPr>
             <w:r>
               <w:rPr>
@@ -2527,7 +3231,7 @@
         </w:tc>
         <w:tc>
           <w:tcPr>
-            <w:tcW w:type="dxa" w:w="806"/>
+            <w:tcW w:type="dxa" w:w="800"/>
             <w:tcBorders>
               <w:top w:val="single" w:color="BFBFBF" w:sz="4"/>
               <w:left w:val="single" w:color="BFBFBF" w:sz="4"/>
@@ -2541,11 +3245,13 @@
               <w:bottom w:type="dxa" w:w="60"/>
               <w:right w:type="dxa" w:w="100"/>
             </w:tcMar>
-          </w:tcPr>
-          <w:p>
-            <w:pPr>
-              <w:spacing w:after="0" w:before="0"/>
-              <w:jc w:val="right"/>
+            <w:vAlign w:val="center"/>
+          </w:tcPr>
+          <w:p>
+            <w:pPr>
+              <w:keepNext/>
+              <w:spacing w:after="0" w:before="0"/>
+              <w:jc w:val="center"/>
             </w:pPr>
             <w:r>
               <w:rPr>
@@ -2558,7 +3264,7 @@
         </w:tc>
         <w:tc>
           <w:tcPr>
-            <w:tcW w:type="dxa" w:w="806"/>
+            <w:tcW w:type="dxa" w:w="900"/>
             <w:tcBorders>
               <w:top w:val="single" w:color="BFBFBF" w:sz="4"/>
               <w:left w:val="single" w:color="BFBFBF" w:sz="4"/>
@@ -2572,11 +3278,13 @@
               <w:bottom w:type="dxa" w:w="60"/>
               <w:right w:type="dxa" w:w="100"/>
             </w:tcMar>
-          </w:tcPr>
-          <w:p>
-            <w:pPr>
-              <w:spacing w:after="0" w:before="0"/>
-              <w:jc w:val="right"/>
+            <w:vAlign w:val="center"/>
+          </w:tcPr>
+          <w:p>
+            <w:pPr>
+              <w:keepNext/>
+              <w:spacing w:after="0" w:before="0"/>
+              <w:jc w:val="center"/>
             </w:pPr>
             <w:r>
               <w:rPr>
@@ -2589,7 +3297,7 @@
         </w:tc>
         <w:tc>
           <w:tcPr>
-            <w:tcW w:type="dxa" w:w="1613"/>
+            <w:tcW w:type="dxa" w:w="1700"/>
             <w:tcBorders>
               <w:top w:val="single" w:color="BFBFBF" w:sz="4"/>
               <w:left w:val="single" w:color="BFBFBF" w:sz="4"/>
@@ -2603,11 +3311,13 @@
               <w:bottom w:type="dxa" w:w="60"/>
               <w:right w:type="dxa" w:w="100"/>
             </w:tcMar>
-          </w:tcPr>
-          <w:p>
-            <w:pPr>
-              <w:spacing w:after="0" w:before="0"/>
-              <w:jc w:val="right"/>
+            <w:vAlign w:val="center"/>
+          </w:tcPr>
+          <w:p>
+            <w:pPr>
+              <w:keepNext/>
+              <w:spacing w:after="0" w:before="0"/>
+              <w:jc w:val="center"/>
             </w:pPr>
             <w:r>
               <w:rPr>
@@ -2620,7 +3330,7 @@
         </w:tc>
         <w:tc>
           <w:tcPr>
-            <w:tcW w:type="dxa" w:w="1081"/>
+            <w:tcW w:type="dxa" w:w="1600"/>
             <w:tcBorders>
               <w:top w:val="single" w:color="BFBFBF" w:sz="4"/>
               <w:left w:val="single" w:color="BFBFBF" w:sz="4"/>
@@ -2634,11 +3344,13 @@
               <w:bottom w:type="dxa" w:w="60"/>
               <w:right w:type="dxa" w:w="100"/>
             </w:tcMar>
-          </w:tcPr>
-          <w:p>
-            <w:pPr>
-              <w:spacing w:after="0" w:before="0"/>
-              <w:jc w:val="right"/>
+            <w:vAlign w:val="center"/>
+          </w:tcPr>
+          <w:p>
+            <w:pPr>
+              <w:keepNext/>
+              <w:spacing w:after="0" w:before="0"/>
+              <w:jc w:val="center"/>
             </w:pPr>
             <w:r>
               <w:rPr>
@@ -2652,26 +3364,29 @@
       </w:tr>
       <w:tr>
         <w:trPr>
+          <w:cantSplit/>
           <w:tblHeader w:val="false"/>
         </w:trPr>
         <w:tc>
           <w:tcPr>
-            <w:tcW w:type="dxa" w:w="3442"/>
-            <w:tcBorders>
-              <w:top w:val="single" w:color="BFBFBF" w:sz="4"/>
-              <w:left w:val="single" w:color="BFBFBF" w:sz="4"/>
-              <w:bottom w:val="single" w:color="BFBFBF" w:sz="4"/>
-              <w:right w:val="single" w:color="BFBFBF" w:sz="4"/>
-            </w:tcBorders>
-            <w:tcMar>
-              <w:top w:type="dxa" w:w="60"/>
-              <w:left w:type="dxa" w:w="100"/>
-              <w:bottom w:type="dxa" w:w="60"/>
-              <w:right w:type="dxa" w:w="100"/>
-            </w:tcMar>
-          </w:tcPr>
-          <w:p>
-            <w:pPr>
+            <w:tcW w:type="dxa" w:w="2560"/>
+            <w:tcBorders>
+              <w:top w:val="single" w:color="BFBFBF" w:sz="4"/>
+              <w:left w:val="single" w:color="BFBFBF" w:sz="4"/>
+              <w:bottom w:val="single" w:color="BFBFBF" w:sz="4"/>
+              <w:right w:val="single" w:color="BFBFBF" w:sz="4"/>
+            </w:tcBorders>
+            <w:tcMar>
+              <w:top w:type="dxa" w:w="60"/>
+              <w:left w:type="dxa" w:w="100"/>
+              <w:bottom w:type="dxa" w:w="60"/>
+              <w:right w:type="dxa" w:w="100"/>
+            </w:tcMar>
+            <w:vAlign w:val="center"/>
+          </w:tcPr>
+          <w:p>
+            <w:pPr>
+              <w:keepNext w:val="false"/>
               <w:spacing w:after="0" w:before="0"/>
               <w:jc w:val="left"/>
             </w:pPr>
@@ -2686,24 +3401,26 @@
         </w:tc>
         <w:tc>
           <w:tcPr>
-            <w:tcW w:type="dxa" w:w="806"/>
-            <w:tcBorders>
-              <w:top w:val="single" w:color="BFBFBF" w:sz="4"/>
-              <w:left w:val="single" w:color="BFBFBF" w:sz="4"/>
-              <w:bottom w:val="single" w:color="BFBFBF" w:sz="4"/>
-              <w:right w:val="single" w:color="BFBFBF" w:sz="4"/>
-            </w:tcBorders>
-            <w:tcMar>
-              <w:top w:type="dxa" w:w="60"/>
-              <w:left w:type="dxa" w:w="100"/>
-              <w:bottom w:type="dxa" w:w="60"/>
-              <w:right w:type="dxa" w:w="100"/>
-            </w:tcMar>
-          </w:tcPr>
-          <w:p>
-            <w:pPr>
-              <w:spacing w:after="0" w:before="0"/>
-              <w:jc w:val="right"/>
+            <w:tcW w:type="dxa" w:w="900"/>
+            <w:tcBorders>
+              <w:top w:val="single" w:color="BFBFBF" w:sz="4"/>
+              <w:left w:val="single" w:color="BFBFBF" w:sz="4"/>
+              <w:bottom w:val="single" w:color="BFBFBF" w:sz="4"/>
+              <w:right w:val="single" w:color="BFBFBF" w:sz="4"/>
+            </w:tcBorders>
+            <w:tcMar>
+              <w:top w:type="dxa" w:w="60"/>
+              <w:left w:type="dxa" w:w="100"/>
+              <w:bottom w:type="dxa" w:w="60"/>
+              <w:right w:type="dxa" w:w="100"/>
+            </w:tcMar>
+            <w:vAlign w:val="center"/>
+          </w:tcPr>
+          <w:p>
+            <w:pPr>
+              <w:keepNext w:val="false"/>
+              <w:spacing w:after="0" w:before="0"/>
+              <w:jc w:val="center"/>
             </w:pPr>
             <w:r>
               <w:rPr>
@@ -2716,24 +3433,26 @@
         </w:tc>
         <w:tc>
           <w:tcPr>
-            <w:tcW w:type="dxa" w:w="806"/>
-            <w:tcBorders>
-              <w:top w:val="single" w:color="BFBFBF" w:sz="4"/>
-              <w:left w:val="single" w:color="BFBFBF" w:sz="4"/>
-              <w:bottom w:val="single" w:color="BFBFBF" w:sz="4"/>
-              <w:right w:val="single" w:color="BFBFBF" w:sz="4"/>
-            </w:tcBorders>
-            <w:tcMar>
-              <w:top w:type="dxa" w:w="60"/>
-              <w:left w:type="dxa" w:w="100"/>
-              <w:bottom w:type="dxa" w:w="60"/>
-              <w:right w:type="dxa" w:w="100"/>
-            </w:tcMar>
-          </w:tcPr>
-          <w:p>
-            <w:pPr>
-              <w:spacing w:after="0" w:before="0"/>
-              <w:jc w:val="right"/>
+            <w:tcW w:type="dxa" w:w="900"/>
+            <w:tcBorders>
+              <w:top w:val="single" w:color="BFBFBF" w:sz="4"/>
+              <w:left w:val="single" w:color="BFBFBF" w:sz="4"/>
+              <w:bottom w:val="single" w:color="BFBFBF" w:sz="4"/>
+              <w:right w:val="single" w:color="BFBFBF" w:sz="4"/>
+            </w:tcBorders>
+            <w:tcMar>
+              <w:top w:type="dxa" w:w="60"/>
+              <w:left w:type="dxa" w:w="100"/>
+              <w:bottom w:type="dxa" w:w="60"/>
+              <w:right w:type="dxa" w:w="100"/>
+            </w:tcMar>
+            <w:vAlign w:val="center"/>
+          </w:tcPr>
+          <w:p>
+            <w:pPr>
+              <w:keepNext w:val="false"/>
+              <w:spacing w:after="0" w:before="0"/>
+              <w:jc w:val="center"/>
             </w:pPr>
             <w:r>
               <w:rPr>
@@ -2746,24 +3465,26 @@
         </w:tc>
         <w:tc>
           <w:tcPr>
-            <w:tcW w:type="dxa" w:w="806"/>
-            <w:tcBorders>
-              <w:top w:val="single" w:color="BFBFBF" w:sz="4"/>
-              <w:left w:val="single" w:color="BFBFBF" w:sz="4"/>
-              <w:bottom w:val="single" w:color="BFBFBF" w:sz="4"/>
-              <w:right w:val="single" w:color="BFBFBF" w:sz="4"/>
-            </w:tcBorders>
-            <w:tcMar>
-              <w:top w:type="dxa" w:w="60"/>
-              <w:left w:type="dxa" w:w="100"/>
-              <w:bottom w:type="dxa" w:w="60"/>
-              <w:right w:type="dxa" w:w="100"/>
-            </w:tcMar>
-          </w:tcPr>
-          <w:p>
-            <w:pPr>
-              <w:spacing w:after="0" w:before="0"/>
-              <w:jc w:val="right"/>
+            <w:tcW w:type="dxa" w:w="800"/>
+            <w:tcBorders>
+              <w:top w:val="single" w:color="BFBFBF" w:sz="4"/>
+              <w:left w:val="single" w:color="BFBFBF" w:sz="4"/>
+              <w:bottom w:val="single" w:color="BFBFBF" w:sz="4"/>
+              <w:right w:val="single" w:color="BFBFBF" w:sz="4"/>
+            </w:tcBorders>
+            <w:tcMar>
+              <w:top w:type="dxa" w:w="60"/>
+              <w:left w:type="dxa" w:w="100"/>
+              <w:bottom w:type="dxa" w:w="60"/>
+              <w:right w:type="dxa" w:w="100"/>
+            </w:tcMar>
+            <w:vAlign w:val="center"/>
+          </w:tcPr>
+          <w:p>
+            <w:pPr>
+              <w:keepNext w:val="false"/>
+              <w:spacing w:after="0" w:before="0"/>
+              <w:jc w:val="center"/>
             </w:pPr>
             <w:r>
               <w:rPr>
@@ -2776,24 +3497,26 @@
         </w:tc>
         <w:tc>
           <w:tcPr>
-            <w:tcW w:type="dxa" w:w="806"/>
-            <w:tcBorders>
-              <w:top w:val="single" w:color="BFBFBF" w:sz="4"/>
-              <w:left w:val="single" w:color="BFBFBF" w:sz="4"/>
-              <w:bottom w:val="single" w:color="BFBFBF" w:sz="4"/>
-              <w:right w:val="single" w:color="BFBFBF" w:sz="4"/>
-            </w:tcBorders>
-            <w:tcMar>
-              <w:top w:type="dxa" w:w="60"/>
-              <w:left w:type="dxa" w:w="100"/>
-              <w:bottom w:type="dxa" w:w="60"/>
-              <w:right w:type="dxa" w:w="100"/>
-            </w:tcMar>
-          </w:tcPr>
-          <w:p>
-            <w:pPr>
-              <w:spacing w:after="0" w:before="0"/>
-              <w:jc w:val="right"/>
+            <w:tcW w:type="dxa" w:w="900"/>
+            <w:tcBorders>
+              <w:top w:val="single" w:color="BFBFBF" w:sz="4"/>
+              <w:left w:val="single" w:color="BFBFBF" w:sz="4"/>
+              <w:bottom w:val="single" w:color="BFBFBF" w:sz="4"/>
+              <w:right w:val="single" w:color="BFBFBF" w:sz="4"/>
+            </w:tcBorders>
+            <w:tcMar>
+              <w:top w:type="dxa" w:w="60"/>
+              <w:left w:type="dxa" w:w="100"/>
+              <w:bottom w:type="dxa" w:w="60"/>
+              <w:right w:type="dxa" w:w="100"/>
+            </w:tcMar>
+            <w:vAlign w:val="center"/>
+          </w:tcPr>
+          <w:p>
+            <w:pPr>
+              <w:keepNext w:val="false"/>
+              <w:spacing w:after="0" w:before="0"/>
+              <w:jc w:val="center"/>
             </w:pPr>
             <w:r>
               <w:rPr>
@@ -2806,24 +3529,26 @@
         </w:tc>
         <w:tc>
           <w:tcPr>
-            <w:tcW w:type="dxa" w:w="1613"/>
-            <w:tcBorders>
-              <w:top w:val="single" w:color="BFBFBF" w:sz="4"/>
-              <w:left w:val="single" w:color="BFBFBF" w:sz="4"/>
-              <w:bottom w:val="single" w:color="BFBFBF" w:sz="4"/>
-              <w:right w:val="single" w:color="BFBFBF" w:sz="4"/>
-            </w:tcBorders>
-            <w:tcMar>
-              <w:top w:type="dxa" w:w="60"/>
-              <w:left w:type="dxa" w:w="100"/>
-              <w:bottom w:type="dxa" w:w="60"/>
-              <w:right w:type="dxa" w:w="100"/>
-            </w:tcMar>
-          </w:tcPr>
-          <w:p>
-            <w:pPr>
-              <w:spacing w:after="0" w:before="0"/>
-              <w:jc w:val="right"/>
+            <w:tcW w:type="dxa" w:w="1700"/>
+            <w:tcBorders>
+              <w:top w:val="single" w:color="BFBFBF" w:sz="4"/>
+              <w:left w:val="single" w:color="BFBFBF" w:sz="4"/>
+              <w:bottom w:val="single" w:color="BFBFBF" w:sz="4"/>
+              <w:right w:val="single" w:color="BFBFBF" w:sz="4"/>
+            </w:tcBorders>
+            <w:tcMar>
+              <w:top w:type="dxa" w:w="60"/>
+              <w:left w:type="dxa" w:w="100"/>
+              <w:bottom w:type="dxa" w:w="60"/>
+              <w:right w:type="dxa" w:w="100"/>
+            </w:tcMar>
+            <w:vAlign w:val="center"/>
+          </w:tcPr>
+          <w:p>
+            <w:pPr>
+              <w:keepNext w:val="false"/>
+              <w:spacing w:after="0" w:before="0"/>
+              <w:jc w:val="center"/>
             </w:pPr>
             <w:r>
               <w:rPr>
@@ -2836,24 +3561,26 @@
         </w:tc>
         <w:tc>
           <w:tcPr>
-            <w:tcW w:type="dxa" w:w="1081"/>
-            <w:tcBorders>
-              <w:top w:val="single" w:color="BFBFBF" w:sz="4"/>
-              <w:left w:val="single" w:color="BFBFBF" w:sz="4"/>
-              <w:bottom w:val="single" w:color="BFBFBF" w:sz="4"/>
-              <w:right w:val="single" w:color="BFBFBF" w:sz="4"/>
-            </w:tcBorders>
-            <w:tcMar>
-              <w:top w:type="dxa" w:w="60"/>
-              <w:left w:type="dxa" w:w="100"/>
-              <w:bottom w:type="dxa" w:w="60"/>
-              <w:right w:type="dxa" w:w="100"/>
-            </w:tcMar>
-          </w:tcPr>
-          <w:p>
-            <w:pPr>
-              <w:spacing w:after="0" w:before="0"/>
-              <w:jc w:val="right"/>
+            <w:tcW w:type="dxa" w:w="1600"/>
+            <w:tcBorders>
+              <w:top w:val="single" w:color="BFBFBF" w:sz="4"/>
+              <w:left w:val="single" w:color="BFBFBF" w:sz="4"/>
+              <w:bottom w:val="single" w:color="BFBFBF" w:sz="4"/>
+              <w:right w:val="single" w:color="BFBFBF" w:sz="4"/>
+            </w:tcBorders>
+            <w:tcMar>
+              <w:top w:type="dxa" w:w="60"/>
+              <w:left w:type="dxa" w:w="100"/>
+              <w:bottom w:type="dxa" w:w="60"/>
+              <w:right w:type="dxa" w:w="100"/>
+            </w:tcMar>
+            <w:vAlign w:val="center"/>
+          </w:tcPr>
+          <w:p>
+            <w:pPr>
+              <w:keepNext w:val="false"/>
+              <w:spacing w:after="0" w:before="0"/>
+              <w:jc w:val="center"/>
             </w:pPr>
             <w:r>
               <w:rPr>
@@ -3260,19 +3987,20 @@
         </w:tblBorders>
       </w:tblPr>
       <w:tblGrid>
-        <w:gridCol w:w="2621"/>
-        <w:gridCol w:w="936"/>
-        <w:gridCol w:w="936"/>
-        <w:gridCol w:w="936"/>
-        <w:gridCol w:w="3931"/>
+        <w:gridCol w:w="2400"/>
+        <w:gridCol w:w="1400"/>
+        <w:gridCol w:w="1800"/>
+        <w:gridCol w:w="1800"/>
+        <w:gridCol w:w="1960"/>
       </w:tblGrid>
       <w:tr>
         <w:trPr>
+          <w:cantSplit/>
           <w:tblHeader/>
         </w:trPr>
         <w:tc>
           <w:tcPr>
-            <w:tcW w:type="dxa" w:w="2621"/>
+            <w:tcW w:type="dxa" w:w="2400"/>
             <w:tcBorders>
               <w:top w:val="single" w:color="BFBFBF" w:sz="4"/>
               <w:left w:val="single" w:color="BFBFBF" w:sz="4"/>
@@ -3286,9 +4014,11 @@
               <w:bottom w:type="dxa" w:w="60"/>
               <w:right w:type="dxa" w:w="100"/>
             </w:tcMar>
-          </w:tcPr>
-          <w:p>
-            <w:pPr>
+            <w:vAlign w:val="center"/>
+          </w:tcPr>
+          <w:p>
+            <w:pPr>
+              <w:keepNext/>
               <w:spacing w:after="0" w:before="0"/>
               <w:jc w:val="left"/>
             </w:pPr>
@@ -3306,7 +4036,7 @@
         </w:tc>
         <w:tc>
           <w:tcPr>
-            <w:tcW w:type="dxa" w:w="936"/>
+            <w:tcW w:type="dxa" w:w="1400"/>
             <w:tcBorders>
               <w:top w:val="single" w:color="BFBFBF" w:sz="4"/>
               <w:left w:val="single" w:color="BFBFBF" w:sz="4"/>
@@ -3320,9 +4050,11 @@
               <w:bottom w:type="dxa" w:w="60"/>
               <w:right w:type="dxa" w:w="100"/>
             </w:tcMar>
-          </w:tcPr>
-          <w:p>
-            <w:pPr>
+            <w:vAlign w:val="center"/>
+          </w:tcPr>
+          <w:p>
+            <w:pPr>
+              <w:keepNext/>
               <w:spacing w:after="0" w:before="0"/>
               <w:jc w:val="left"/>
             </w:pPr>
@@ -3340,7 +4072,7 @@
         </w:tc>
         <w:tc>
           <w:tcPr>
-            <w:tcW w:type="dxa" w:w="936"/>
+            <w:tcW w:type="dxa" w:w="1800"/>
             <w:tcBorders>
               <w:top w:val="single" w:color="BFBFBF" w:sz="4"/>
               <w:left w:val="single" w:color="BFBFBF" w:sz="4"/>
@@ -3354,9 +4086,11 @@
               <w:bottom w:type="dxa" w:w="60"/>
               <w:right w:type="dxa" w:w="100"/>
             </w:tcMar>
-          </w:tcPr>
-          <w:p>
-            <w:pPr>
+            <w:vAlign w:val="center"/>
+          </w:tcPr>
+          <w:p>
+            <w:pPr>
+              <w:keepNext/>
               <w:spacing w:after="0" w:before="0"/>
               <w:jc w:val="left"/>
             </w:pPr>
@@ -3374,7 +4108,7 @@
         </w:tc>
         <w:tc>
           <w:tcPr>
-            <w:tcW w:type="dxa" w:w="936"/>
+            <w:tcW w:type="dxa" w:w="1800"/>
             <w:tcBorders>
               <w:top w:val="single" w:color="BFBFBF" w:sz="4"/>
               <w:left w:val="single" w:color="BFBFBF" w:sz="4"/>
@@ -3388,9 +4122,11 @@
               <w:bottom w:type="dxa" w:w="60"/>
               <w:right w:type="dxa" w:w="100"/>
             </w:tcMar>
-          </w:tcPr>
-          <w:p>
-            <w:pPr>
+            <w:vAlign w:val="center"/>
+          </w:tcPr>
+          <w:p>
+            <w:pPr>
+              <w:keepNext/>
               <w:spacing w:after="0" w:before="0"/>
               <w:jc w:val="left"/>
             </w:pPr>
@@ -3408,7 +4144,7 @@
         </w:tc>
         <w:tc>
           <w:tcPr>
-            <w:tcW w:type="dxa" w:w="3931"/>
+            <w:tcW w:type="dxa" w:w="1960"/>
             <w:tcBorders>
               <w:top w:val="single" w:color="BFBFBF" w:sz="4"/>
               <w:left w:val="single" w:color="BFBFBF" w:sz="4"/>
@@ -3422,9 +4158,11 @@
               <w:bottom w:type="dxa" w:w="60"/>
               <w:right w:type="dxa" w:w="100"/>
             </w:tcMar>
-          </w:tcPr>
-          <w:p>
-            <w:pPr>
+            <w:vAlign w:val="center"/>
+          </w:tcPr>
+          <w:p>
+            <w:pPr>
+              <w:keepNext/>
               <w:spacing w:after="0" w:before="0"/>
               <w:jc w:val="left"/>
             </w:pPr>
@@ -3443,26 +4181,29 @@
       </w:tr>
       <w:tr>
         <w:trPr>
+          <w:cantSplit/>
           <w:tblHeader w:val="false"/>
         </w:trPr>
         <w:tc>
           <w:tcPr>
-            <w:tcW w:type="dxa" w:w="2621"/>
-            <w:tcBorders>
-              <w:top w:val="single" w:color="BFBFBF" w:sz="4"/>
-              <w:left w:val="single" w:color="BFBFBF" w:sz="4"/>
-              <w:bottom w:val="single" w:color="BFBFBF" w:sz="4"/>
-              <w:right w:val="single" w:color="BFBFBF" w:sz="4"/>
-            </w:tcBorders>
-            <w:tcMar>
-              <w:top w:type="dxa" w:w="60"/>
-              <w:left w:type="dxa" w:w="100"/>
-              <w:bottom w:type="dxa" w:w="60"/>
-              <w:right w:type="dxa" w:w="100"/>
-            </w:tcMar>
-          </w:tcPr>
-          <w:p>
-            <w:pPr>
+            <w:tcW w:type="dxa" w:w="2400"/>
+            <w:tcBorders>
+              <w:top w:val="single" w:color="BFBFBF" w:sz="4"/>
+              <w:left w:val="single" w:color="BFBFBF" w:sz="4"/>
+              <w:bottom w:val="single" w:color="BFBFBF" w:sz="4"/>
+              <w:right w:val="single" w:color="BFBFBF" w:sz="4"/>
+            </w:tcBorders>
+            <w:tcMar>
+              <w:top w:type="dxa" w:w="60"/>
+              <w:left w:type="dxa" w:w="100"/>
+              <w:bottom w:type="dxa" w:w="60"/>
+              <w:right w:type="dxa" w:w="100"/>
+            </w:tcMar>
+            <w:vAlign w:val="center"/>
+          </w:tcPr>
+          <w:p>
+            <w:pPr>
+              <w:keepNext/>
               <w:spacing w:after="0" w:before="0"/>
               <w:jc w:val="left"/>
             </w:pPr>
@@ -3477,24 +4218,26 @@
         </w:tc>
         <w:tc>
           <w:tcPr>
-            <w:tcW w:type="dxa" w:w="936"/>
-            <w:tcBorders>
-              <w:top w:val="single" w:color="BFBFBF" w:sz="4"/>
-              <w:left w:val="single" w:color="BFBFBF" w:sz="4"/>
-              <w:bottom w:val="single" w:color="BFBFBF" w:sz="4"/>
-              <w:right w:val="single" w:color="BFBFBF" w:sz="4"/>
-            </w:tcBorders>
-            <w:tcMar>
-              <w:top w:type="dxa" w:w="60"/>
-              <w:left w:type="dxa" w:w="100"/>
-              <w:bottom w:type="dxa" w:w="60"/>
-              <w:right w:type="dxa" w:w="100"/>
-            </w:tcMar>
-          </w:tcPr>
-          <w:p>
-            <w:pPr>
-              <w:spacing w:after="0" w:before="0"/>
-              <w:jc w:val="right"/>
+            <w:tcW w:type="dxa" w:w="1400"/>
+            <w:tcBorders>
+              <w:top w:val="single" w:color="BFBFBF" w:sz="4"/>
+              <w:left w:val="single" w:color="BFBFBF" w:sz="4"/>
+              <w:bottom w:val="single" w:color="BFBFBF" w:sz="4"/>
+              <w:right w:val="single" w:color="BFBFBF" w:sz="4"/>
+            </w:tcBorders>
+            <w:tcMar>
+              <w:top w:type="dxa" w:w="60"/>
+              <w:left w:type="dxa" w:w="100"/>
+              <w:bottom w:type="dxa" w:w="60"/>
+              <w:right w:type="dxa" w:w="100"/>
+            </w:tcMar>
+            <w:vAlign w:val="center"/>
+          </w:tcPr>
+          <w:p>
+            <w:pPr>
+              <w:keepNext/>
+              <w:spacing w:after="0" w:before="0"/>
+              <w:jc w:val="center"/>
             </w:pPr>
             <w:r>
               <w:rPr>
@@ -3507,24 +4250,26 @@
         </w:tc>
         <w:tc>
           <w:tcPr>
-            <w:tcW w:type="dxa" w:w="936"/>
-            <w:tcBorders>
-              <w:top w:val="single" w:color="BFBFBF" w:sz="4"/>
-              <w:left w:val="single" w:color="BFBFBF" w:sz="4"/>
-              <w:bottom w:val="single" w:color="BFBFBF" w:sz="4"/>
-              <w:right w:val="single" w:color="BFBFBF" w:sz="4"/>
-            </w:tcBorders>
-            <w:tcMar>
-              <w:top w:type="dxa" w:w="60"/>
-              <w:left w:type="dxa" w:w="100"/>
-              <w:bottom w:type="dxa" w:w="60"/>
-              <w:right w:type="dxa" w:w="100"/>
-            </w:tcMar>
-          </w:tcPr>
-          <w:p>
-            <w:pPr>
-              <w:spacing w:after="0" w:before="0"/>
-              <w:jc w:val="right"/>
+            <w:tcW w:type="dxa" w:w="1800"/>
+            <w:tcBorders>
+              <w:top w:val="single" w:color="BFBFBF" w:sz="4"/>
+              <w:left w:val="single" w:color="BFBFBF" w:sz="4"/>
+              <w:bottom w:val="single" w:color="BFBFBF" w:sz="4"/>
+              <w:right w:val="single" w:color="BFBFBF" w:sz="4"/>
+            </w:tcBorders>
+            <w:tcMar>
+              <w:top w:type="dxa" w:w="60"/>
+              <w:left w:type="dxa" w:w="100"/>
+              <w:bottom w:type="dxa" w:w="60"/>
+              <w:right w:type="dxa" w:w="100"/>
+            </w:tcMar>
+            <w:vAlign w:val="center"/>
+          </w:tcPr>
+          <w:p>
+            <w:pPr>
+              <w:keepNext/>
+              <w:spacing w:after="0" w:before="0"/>
+              <w:jc w:val="center"/>
             </w:pPr>
             <w:r>
               <w:rPr>
@@ -3537,24 +4282,26 @@
         </w:tc>
         <w:tc>
           <w:tcPr>
-            <w:tcW w:type="dxa" w:w="936"/>
-            <w:tcBorders>
-              <w:top w:val="single" w:color="BFBFBF" w:sz="4"/>
-              <w:left w:val="single" w:color="BFBFBF" w:sz="4"/>
-              <w:bottom w:val="single" w:color="BFBFBF" w:sz="4"/>
-              <w:right w:val="single" w:color="BFBFBF" w:sz="4"/>
-            </w:tcBorders>
-            <w:tcMar>
-              <w:top w:type="dxa" w:w="60"/>
-              <w:left w:type="dxa" w:w="100"/>
-              <w:bottom w:type="dxa" w:w="60"/>
-              <w:right w:type="dxa" w:w="100"/>
-            </w:tcMar>
-          </w:tcPr>
-          <w:p>
-            <w:pPr>
-              <w:spacing w:after="0" w:before="0"/>
-              <w:jc w:val="right"/>
+            <w:tcW w:type="dxa" w:w="1800"/>
+            <w:tcBorders>
+              <w:top w:val="single" w:color="BFBFBF" w:sz="4"/>
+              <w:left w:val="single" w:color="BFBFBF" w:sz="4"/>
+              <w:bottom w:val="single" w:color="BFBFBF" w:sz="4"/>
+              <w:right w:val="single" w:color="BFBFBF" w:sz="4"/>
+            </w:tcBorders>
+            <w:tcMar>
+              <w:top w:type="dxa" w:w="60"/>
+              <w:left w:type="dxa" w:w="100"/>
+              <w:bottom w:type="dxa" w:w="60"/>
+              <w:right w:type="dxa" w:w="100"/>
+            </w:tcMar>
+            <w:vAlign w:val="center"/>
+          </w:tcPr>
+          <w:p>
+            <w:pPr>
+              <w:keepNext/>
+              <w:spacing w:after="0" w:before="0"/>
+              <w:jc w:val="center"/>
             </w:pPr>
             <w:r>
               <w:rPr>
@@ -3567,24 +4314,26 @@
         </w:tc>
         <w:tc>
           <w:tcPr>
-            <w:tcW w:type="dxa" w:w="3931"/>
-            <w:tcBorders>
-              <w:top w:val="single" w:color="BFBFBF" w:sz="4"/>
-              <w:left w:val="single" w:color="BFBFBF" w:sz="4"/>
-              <w:bottom w:val="single" w:color="BFBFBF" w:sz="4"/>
-              <w:right w:val="single" w:color="BFBFBF" w:sz="4"/>
-            </w:tcBorders>
-            <w:tcMar>
-              <w:top w:type="dxa" w:w="60"/>
-              <w:left w:type="dxa" w:w="100"/>
-              <w:bottom w:type="dxa" w:w="60"/>
-              <w:right w:type="dxa" w:w="100"/>
-            </w:tcMar>
-          </w:tcPr>
-          <w:p>
-            <w:pPr>
-              <w:spacing w:after="0" w:before="0"/>
-              <w:jc w:val="right"/>
+            <w:tcW w:type="dxa" w:w="1960"/>
+            <w:tcBorders>
+              <w:top w:val="single" w:color="BFBFBF" w:sz="4"/>
+              <w:left w:val="single" w:color="BFBFBF" w:sz="4"/>
+              <w:bottom w:val="single" w:color="BFBFBF" w:sz="4"/>
+              <w:right w:val="single" w:color="BFBFBF" w:sz="4"/>
+            </w:tcBorders>
+            <w:tcMar>
+              <w:top w:type="dxa" w:w="60"/>
+              <w:left w:type="dxa" w:w="100"/>
+              <w:bottom w:type="dxa" w:w="60"/>
+              <w:right w:type="dxa" w:w="100"/>
+            </w:tcMar>
+            <w:vAlign w:val="center"/>
+          </w:tcPr>
+          <w:p>
+            <w:pPr>
+              <w:keepNext/>
+              <w:spacing w:after="0" w:before="0"/>
+              <w:jc w:val="center"/>
             </w:pPr>
             <w:r>
               <w:rPr>
@@ -3598,11 +4347,12 @@
       </w:tr>
       <w:tr>
         <w:trPr>
+          <w:cantSplit/>
           <w:tblHeader w:val="false"/>
         </w:trPr>
         <w:tc>
           <w:tcPr>
-            <w:tcW w:type="dxa" w:w="2621"/>
+            <w:tcW w:type="dxa" w:w="2400"/>
             <w:tcBorders>
               <w:top w:val="single" w:color="BFBFBF" w:sz="4"/>
               <w:left w:val="single" w:color="BFBFBF" w:sz="4"/>
@@ -3616,9 +4366,11 @@
               <w:bottom w:type="dxa" w:w="60"/>
               <w:right w:type="dxa" w:w="100"/>
             </w:tcMar>
-          </w:tcPr>
-          <w:p>
-            <w:pPr>
+            <w:vAlign w:val="center"/>
+          </w:tcPr>
+          <w:p>
+            <w:pPr>
+              <w:keepNext/>
               <w:spacing w:after="0" w:before="0"/>
               <w:jc w:val="left"/>
             </w:pPr>
@@ -3633,7 +4385,7 @@
         </w:tc>
         <w:tc>
           <w:tcPr>
-            <w:tcW w:type="dxa" w:w="936"/>
+            <w:tcW w:type="dxa" w:w="1400"/>
             <w:tcBorders>
               <w:top w:val="single" w:color="BFBFBF" w:sz="4"/>
               <w:left w:val="single" w:color="BFBFBF" w:sz="4"/>
@@ -3647,11 +4399,13 @@
               <w:bottom w:type="dxa" w:w="60"/>
               <w:right w:type="dxa" w:w="100"/>
             </w:tcMar>
-          </w:tcPr>
-          <w:p>
-            <w:pPr>
-              <w:spacing w:after="0" w:before="0"/>
-              <w:jc w:val="right"/>
+            <w:vAlign w:val="center"/>
+          </w:tcPr>
+          <w:p>
+            <w:pPr>
+              <w:keepNext/>
+              <w:spacing w:after="0" w:before="0"/>
+              <w:jc w:val="center"/>
             </w:pPr>
             <w:r>
               <w:rPr>
@@ -3664,7 +4418,7 @@
         </w:tc>
         <w:tc>
           <w:tcPr>
-            <w:tcW w:type="dxa" w:w="936"/>
+            <w:tcW w:type="dxa" w:w="1800"/>
             <w:tcBorders>
               <w:top w:val="single" w:color="BFBFBF" w:sz="4"/>
               <w:left w:val="single" w:color="BFBFBF" w:sz="4"/>
@@ -3678,11 +4432,13 @@
               <w:bottom w:type="dxa" w:w="60"/>
               <w:right w:type="dxa" w:w="100"/>
             </w:tcMar>
-          </w:tcPr>
-          <w:p>
-            <w:pPr>
-              <w:spacing w:after="0" w:before="0"/>
-              <w:jc w:val="right"/>
+            <w:vAlign w:val="center"/>
+          </w:tcPr>
+          <w:p>
+            <w:pPr>
+              <w:keepNext/>
+              <w:spacing w:after="0" w:before="0"/>
+              <w:jc w:val="center"/>
             </w:pPr>
             <w:r>
               <w:rPr>
@@ -3695,7 +4451,7 @@
         </w:tc>
         <w:tc>
           <w:tcPr>
-            <w:tcW w:type="dxa" w:w="936"/>
+            <w:tcW w:type="dxa" w:w="1800"/>
             <w:tcBorders>
               <w:top w:val="single" w:color="BFBFBF" w:sz="4"/>
               <w:left w:val="single" w:color="BFBFBF" w:sz="4"/>
@@ -3709,11 +4465,13 @@
               <w:bottom w:type="dxa" w:w="60"/>
               <w:right w:type="dxa" w:w="100"/>
             </w:tcMar>
-          </w:tcPr>
-          <w:p>
-            <w:pPr>
-              <w:spacing w:after="0" w:before="0"/>
-              <w:jc w:val="right"/>
+            <w:vAlign w:val="center"/>
+          </w:tcPr>
+          <w:p>
+            <w:pPr>
+              <w:keepNext/>
+              <w:spacing w:after="0" w:before="0"/>
+              <w:jc w:val="center"/>
             </w:pPr>
             <w:r>
               <w:rPr>
@@ -3726,7 +4484,7 @@
         </w:tc>
         <w:tc>
           <w:tcPr>
-            <w:tcW w:type="dxa" w:w="3931"/>
+            <w:tcW w:type="dxa" w:w="1960"/>
             <w:tcBorders>
               <w:top w:val="single" w:color="BFBFBF" w:sz="4"/>
               <w:left w:val="single" w:color="BFBFBF" w:sz="4"/>
@@ -3740,11 +4498,13 @@
               <w:bottom w:type="dxa" w:w="60"/>
               <w:right w:type="dxa" w:w="100"/>
             </w:tcMar>
-          </w:tcPr>
-          <w:p>
-            <w:pPr>
-              <w:spacing w:after="0" w:before="0"/>
-              <w:jc w:val="right"/>
+            <w:vAlign w:val="center"/>
+          </w:tcPr>
+          <w:p>
+            <w:pPr>
+              <w:keepNext/>
+              <w:spacing w:after="0" w:before="0"/>
+              <w:jc w:val="center"/>
             </w:pPr>
             <w:r>
               <w:rPr>
@@ -3758,26 +4518,29 @@
       </w:tr>
       <w:tr>
         <w:trPr>
+          <w:cantSplit/>
           <w:tblHeader w:val="false"/>
         </w:trPr>
         <w:tc>
           <w:tcPr>
-            <w:tcW w:type="dxa" w:w="2621"/>
-            <w:tcBorders>
-              <w:top w:val="single" w:color="BFBFBF" w:sz="4"/>
-              <w:left w:val="single" w:color="BFBFBF" w:sz="4"/>
-              <w:bottom w:val="single" w:color="BFBFBF" w:sz="4"/>
-              <w:right w:val="single" w:color="BFBFBF" w:sz="4"/>
-            </w:tcBorders>
-            <w:tcMar>
-              <w:top w:type="dxa" w:w="60"/>
-              <w:left w:type="dxa" w:w="100"/>
-              <w:bottom w:type="dxa" w:w="60"/>
-              <w:right w:type="dxa" w:w="100"/>
-            </w:tcMar>
-          </w:tcPr>
-          <w:p>
-            <w:pPr>
+            <w:tcW w:type="dxa" w:w="2400"/>
+            <w:tcBorders>
+              <w:top w:val="single" w:color="BFBFBF" w:sz="4"/>
+              <w:left w:val="single" w:color="BFBFBF" w:sz="4"/>
+              <w:bottom w:val="single" w:color="BFBFBF" w:sz="4"/>
+              <w:right w:val="single" w:color="BFBFBF" w:sz="4"/>
+            </w:tcBorders>
+            <w:tcMar>
+              <w:top w:type="dxa" w:w="60"/>
+              <w:left w:type="dxa" w:w="100"/>
+              <w:bottom w:type="dxa" w:w="60"/>
+              <w:right w:type="dxa" w:w="100"/>
+            </w:tcMar>
+            <w:vAlign w:val="center"/>
+          </w:tcPr>
+          <w:p>
+            <w:pPr>
+              <w:keepNext/>
               <w:spacing w:after="0" w:before="0"/>
               <w:jc w:val="left"/>
             </w:pPr>
@@ -3792,24 +4555,26 @@
         </w:tc>
         <w:tc>
           <w:tcPr>
-            <w:tcW w:type="dxa" w:w="936"/>
-            <w:tcBorders>
-              <w:top w:val="single" w:color="BFBFBF" w:sz="4"/>
-              <w:left w:val="single" w:color="BFBFBF" w:sz="4"/>
-              <w:bottom w:val="single" w:color="BFBFBF" w:sz="4"/>
-              <w:right w:val="single" w:color="BFBFBF" w:sz="4"/>
-            </w:tcBorders>
-            <w:tcMar>
-              <w:top w:type="dxa" w:w="60"/>
-              <w:left w:type="dxa" w:w="100"/>
-              <w:bottom w:type="dxa" w:w="60"/>
-              <w:right w:type="dxa" w:w="100"/>
-            </w:tcMar>
-          </w:tcPr>
-          <w:p>
-            <w:pPr>
-              <w:spacing w:after="0" w:before="0"/>
-              <w:jc w:val="right"/>
+            <w:tcW w:type="dxa" w:w="1400"/>
+            <w:tcBorders>
+              <w:top w:val="single" w:color="BFBFBF" w:sz="4"/>
+              <w:left w:val="single" w:color="BFBFBF" w:sz="4"/>
+              <w:bottom w:val="single" w:color="BFBFBF" w:sz="4"/>
+              <w:right w:val="single" w:color="BFBFBF" w:sz="4"/>
+            </w:tcBorders>
+            <w:tcMar>
+              <w:top w:type="dxa" w:w="60"/>
+              <w:left w:type="dxa" w:w="100"/>
+              <w:bottom w:type="dxa" w:w="60"/>
+              <w:right w:type="dxa" w:w="100"/>
+            </w:tcMar>
+            <w:vAlign w:val="center"/>
+          </w:tcPr>
+          <w:p>
+            <w:pPr>
+              <w:keepNext/>
+              <w:spacing w:after="0" w:before="0"/>
+              <w:jc w:val="center"/>
             </w:pPr>
             <w:r>
               <w:rPr>
@@ -3822,24 +4587,26 @@
         </w:tc>
         <w:tc>
           <w:tcPr>
-            <w:tcW w:type="dxa" w:w="936"/>
-            <w:tcBorders>
-              <w:top w:val="single" w:color="BFBFBF" w:sz="4"/>
-              <w:left w:val="single" w:color="BFBFBF" w:sz="4"/>
-              <w:bottom w:val="single" w:color="BFBFBF" w:sz="4"/>
-              <w:right w:val="single" w:color="BFBFBF" w:sz="4"/>
-            </w:tcBorders>
-            <w:tcMar>
-              <w:top w:type="dxa" w:w="60"/>
-              <w:left w:type="dxa" w:w="100"/>
-              <w:bottom w:type="dxa" w:w="60"/>
-              <w:right w:type="dxa" w:w="100"/>
-            </w:tcMar>
-          </w:tcPr>
-          <w:p>
-            <w:pPr>
-              <w:spacing w:after="0" w:before="0"/>
-              <w:jc w:val="right"/>
+            <w:tcW w:type="dxa" w:w="1800"/>
+            <w:tcBorders>
+              <w:top w:val="single" w:color="BFBFBF" w:sz="4"/>
+              <w:left w:val="single" w:color="BFBFBF" w:sz="4"/>
+              <w:bottom w:val="single" w:color="BFBFBF" w:sz="4"/>
+              <w:right w:val="single" w:color="BFBFBF" w:sz="4"/>
+            </w:tcBorders>
+            <w:tcMar>
+              <w:top w:type="dxa" w:w="60"/>
+              <w:left w:type="dxa" w:w="100"/>
+              <w:bottom w:type="dxa" w:w="60"/>
+              <w:right w:type="dxa" w:w="100"/>
+            </w:tcMar>
+            <w:vAlign w:val="center"/>
+          </w:tcPr>
+          <w:p>
+            <w:pPr>
+              <w:keepNext/>
+              <w:spacing w:after="0" w:before="0"/>
+              <w:jc w:val="center"/>
             </w:pPr>
             <w:r>
               <w:rPr>
@@ -3852,24 +4619,26 @@
         </w:tc>
         <w:tc>
           <w:tcPr>
-            <w:tcW w:type="dxa" w:w="936"/>
-            <w:tcBorders>
-              <w:top w:val="single" w:color="BFBFBF" w:sz="4"/>
-              <w:left w:val="single" w:color="BFBFBF" w:sz="4"/>
-              <w:bottom w:val="single" w:color="BFBFBF" w:sz="4"/>
-              <w:right w:val="single" w:color="BFBFBF" w:sz="4"/>
-            </w:tcBorders>
-            <w:tcMar>
-              <w:top w:type="dxa" w:w="60"/>
-              <w:left w:type="dxa" w:w="100"/>
-              <w:bottom w:type="dxa" w:w="60"/>
-              <w:right w:type="dxa" w:w="100"/>
-            </w:tcMar>
-          </w:tcPr>
-          <w:p>
-            <w:pPr>
-              <w:spacing w:after="0" w:before="0"/>
-              <w:jc w:val="right"/>
+            <w:tcW w:type="dxa" w:w="1800"/>
+            <w:tcBorders>
+              <w:top w:val="single" w:color="BFBFBF" w:sz="4"/>
+              <w:left w:val="single" w:color="BFBFBF" w:sz="4"/>
+              <w:bottom w:val="single" w:color="BFBFBF" w:sz="4"/>
+              <w:right w:val="single" w:color="BFBFBF" w:sz="4"/>
+            </w:tcBorders>
+            <w:tcMar>
+              <w:top w:type="dxa" w:w="60"/>
+              <w:left w:type="dxa" w:w="100"/>
+              <w:bottom w:type="dxa" w:w="60"/>
+              <w:right w:type="dxa" w:w="100"/>
+            </w:tcMar>
+            <w:vAlign w:val="center"/>
+          </w:tcPr>
+          <w:p>
+            <w:pPr>
+              <w:keepNext/>
+              <w:spacing w:after="0" w:before="0"/>
+              <w:jc w:val="center"/>
             </w:pPr>
             <w:r>
               <w:rPr>
@@ -3882,24 +4651,26 @@
         </w:tc>
         <w:tc>
           <w:tcPr>
-            <w:tcW w:type="dxa" w:w="3931"/>
-            <w:tcBorders>
-              <w:top w:val="single" w:color="BFBFBF" w:sz="4"/>
-              <w:left w:val="single" w:color="BFBFBF" w:sz="4"/>
-              <w:bottom w:val="single" w:color="BFBFBF" w:sz="4"/>
-              <w:right w:val="single" w:color="BFBFBF" w:sz="4"/>
-            </w:tcBorders>
-            <w:tcMar>
-              <w:top w:type="dxa" w:w="60"/>
-              <w:left w:type="dxa" w:w="100"/>
-              <w:bottom w:type="dxa" w:w="60"/>
-              <w:right w:type="dxa" w:w="100"/>
-            </w:tcMar>
-          </w:tcPr>
-          <w:p>
-            <w:pPr>
-              <w:spacing w:after="0" w:before="0"/>
-              <w:jc w:val="right"/>
+            <w:tcW w:type="dxa" w:w="1960"/>
+            <w:tcBorders>
+              <w:top w:val="single" w:color="BFBFBF" w:sz="4"/>
+              <w:left w:val="single" w:color="BFBFBF" w:sz="4"/>
+              <w:bottom w:val="single" w:color="BFBFBF" w:sz="4"/>
+              <w:right w:val="single" w:color="BFBFBF" w:sz="4"/>
+            </w:tcBorders>
+            <w:tcMar>
+              <w:top w:type="dxa" w:w="60"/>
+              <w:left w:type="dxa" w:w="100"/>
+              <w:bottom w:type="dxa" w:w="60"/>
+              <w:right w:type="dxa" w:w="100"/>
+            </w:tcMar>
+            <w:vAlign w:val="center"/>
+          </w:tcPr>
+          <w:p>
+            <w:pPr>
+              <w:keepNext/>
+              <w:spacing w:after="0" w:before="0"/>
+              <w:jc w:val="center"/>
             </w:pPr>
             <w:r>
               <w:rPr>
@@ -3913,11 +4684,12 @@
       </w:tr>
       <w:tr>
         <w:trPr>
+          <w:cantSplit/>
           <w:tblHeader w:val="false"/>
         </w:trPr>
         <w:tc>
           <w:tcPr>
-            <w:tcW w:type="dxa" w:w="2621"/>
+            <w:tcW w:type="dxa" w:w="2400"/>
             <w:tcBorders>
               <w:top w:val="single" w:color="BFBFBF" w:sz="4"/>
               <w:left w:val="single" w:color="BFBFBF" w:sz="4"/>
@@ -3931,9 +4703,11 @@
               <w:bottom w:type="dxa" w:w="60"/>
               <w:right w:type="dxa" w:w="100"/>
             </w:tcMar>
-          </w:tcPr>
-          <w:p>
-            <w:pPr>
+            <w:vAlign w:val="center"/>
+          </w:tcPr>
+          <w:p>
+            <w:pPr>
+              <w:keepNext w:val="false"/>
               <w:spacing w:after="0" w:before="0"/>
               <w:jc w:val="left"/>
             </w:pPr>
@@ -3948,7 +4722,7 @@
         </w:tc>
         <w:tc>
           <w:tcPr>
-            <w:tcW w:type="dxa" w:w="936"/>
+            <w:tcW w:type="dxa" w:w="1400"/>
             <w:tcBorders>
               <w:top w:val="single" w:color="BFBFBF" w:sz="4"/>
               <w:left w:val="single" w:color="BFBFBF" w:sz="4"/>
@@ -3962,11 +4736,13 @@
               <w:bottom w:type="dxa" w:w="60"/>
               <w:right w:type="dxa" w:w="100"/>
             </w:tcMar>
-          </w:tcPr>
-          <w:p>
-            <w:pPr>
-              <w:spacing w:after="0" w:before="0"/>
-              <w:jc w:val="right"/>
+            <w:vAlign w:val="center"/>
+          </w:tcPr>
+          <w:p>
+            <w:pPr>
+              <w:keepNext w:val="false"/>
+              <w:spacing w:after="0" w:before="0"/>
+              <w:jc w:val="center"/>
             </w:pPr>
             <w:r>
               <w:rPr>
@@ -3979,7 +4755,7 @@
         </w:tc>
         <w:tc>
           <w:tcPr>
-            <w:tcW w:type="dxa" w:w="936"/>
+            <w:tcW w:type="dxa" w:w="1800"/>
             <w:tcBorders>
               <w:top w:val="single" w:color="BFBFBF" w:sz="4"/>
               <w:left w:val="single" w:color="BFBFBF" w:sz="4"/>
@@ -3993,11 +4769,13 @@
               <w:bottom w:type="dxa" w:w="60"/>
               <w:right w:type="dxa" w:w="100"/>
             </w:tcMar>
-          </w:tcPr>
-          <w:p>
-            <w:pPr>
-              <w:spacing w:after="0" w:before="0"/>
-              <w:jc w:val="right"/>
+            <w:vAlign w:val="center"/>
+          </w:tcPr>
+          <w:p>
+            <w:pPr>
+              <w:keepNext w:val="false"/>
+              <w:spacing w:after="0" w:before="0"/>
+              <w:jc w:val="center"/>
             </w:pPr>
             <w:r>
               <w:rPr>
@@ -4012,7 +4790,7 @@
         </w:tc>
         <w:tc>
           <w:tcPr>
-            <w:tcW w:type="dxa" w:w="936"/>
+            <w:tcW w:type="dxa" w:w="1800"/>
             <w:tcBorders>
               <w:top w:val="single" w:color="BFBFBF" w:sz="4"/>
               <w:left w:val="single" w:color="BFBFBF" w:sz="4"/>
@@ -4026,11 +4804,13 @@
               <w:bottom w:type="dxa" w:w="60"/>
               <w:right w:type="dxa" w:w="100"/>
             </w:tcMar>
-          </w:tcPr>
-          <w:p>
-            <w:pPr>
-              <w:spacing w:after="0" w:before="0"/>
-              <w:jc w:val="right"/>
+            <w:vAlign w:val="center"/>
+          </w:tcPr>
+          <w:p>
+            <w:pPr>
+              <w:keepNext w:val="false"/>
+              <w:spacing w:after="0" w:before="0"/>
+              <w:jc w:val="center"/>
             </w:pPr>
             <w:r>
               <w:rPr>
@@ -4045,7 +4825,7 @@
         </w:tc>
         <w:tc>
           <w:tcPr>
-            <w:tcW w:type="dxa" w:w="3931"/>
+            <w:tcW w:type="dxa" w:w="1960"/>
             <w:tcBorders>
               <w:top w:val="single" w:color="BFBFBF" w:sz="4"/>
               <w:left w:val="single" w:color="BFBFBF" w:sz="4"/>
@@ -4059,11 +4839,13 @@
               <w:bottom w:type="dxa" w:w="60"/>
               <w:right w:type="dxa" w:w="100"/>
             </w:tcMar>
-          </w:tcPr>
-          <w:p>
-            <w:pPr>
-              <w:spacing w:after="0" w:before="0"/>
-              <w:jc w:val="right"/>
+            <w:vAlign w:val="center"/>
+          </w:tcPr>
+          <w:p>
+            <w:pPr>
+              <w:keepNext w:val="false"/>
+              <w:spacing w:after="0" w:before="0"/>
+              <w:jc w:val="center"/>
             </w:pPr>
             <w:r>
               <w:rPr>
@@ -4402,17 +5184,18 @@
         </w:tblBorders>
       </w:tblPr>
       <w:tblGrid>
-        <w:gridCol w:w="5115"/>
-        <w:gridCol w:w="2830"/>
-        <w:gridCol w:w="1415"/>
+        <w:gridCol w:w="4560"/>
+        <w:gridCol w:w="2600"/>
+        <w:gridCol w:w="2200"/>
       </w:tblGrid>
       <w:tr>
         <w:trPr>
+          <w:cantSplit/>
           <w:tblHeader/>
         </w:trPr>
         <w:tc>
           <w:tcPr>
-            <w:tcW w:type="dxa" w:w="5115"/>
+            <w:tcW w:type="dxa" w:w="4560"/>
             <w:tcBorders>
               <w:top w:val="single" w:color="BFBFBF" w:sz="4"/>
               <w:left w:val="single" w:color="BFBFBF" w:sz="4"/>
@@ -4426,9 +5209,11 @@
               <w:bottom w:type="dxa" w:w="60"/>
               <w:right w:type="dxa" w:w="100"/>
             </w:tcMar>
-          </w:tcPr>
-          <w:p>
-            <w:pPr>
+            <w:vAlign w:val="center"/>
+          </w:tcPr>
+          <w:p>
+            <w:pPr>
+              <w:keepNext/>
               <w:spacing w:after="0" w:before="0"/>
               <w:jc w:val="left"/>
             </w:pPr>
@@ -4446,7 +5231,7 @@
         </w:tc>
         <w:tc>
           <w:tcPr>
-            <w:tcW w:type="dxa" w:w="2830"/>
+            <w:tcW w:type="dxa" w:w="2600"/>
             <w:tcBorders>
               <w:top w:val="single" w:color="BFBFBF" w:sz="4"/>
               <w:left w:val="single" w:color="BFBFBF" w:sz="4"/>
@@ -4460,9 +5245,11 @@
               <w:bottom w:type="dxa" w:w="60"/>
               <w:right w:type="dxa" w:w="100"/>
             </w:tcMar>
-          </w:tcPr>
-          <w:p>
-            <w:pPr>
+            <w:vAlign w:val="center"/>
+          </w:tcPr>
+          <w:p>
+            <w:pPr>
+              <w:keepNext/>
               <w:spacing w:after="0" w:before="0"/>
               <w:jc w:val="left"/>
             </w:pPr>
@@ -4480,7 +5267,7 @@
         </w:tc>
         <w:tc>
           <w:tcPr>
-            <w:tcW w:type="dxa" w:w="1415"/>
+            <w:tcW w:type="dxa" w:w="2200"/>
             <w:tcBorders>
               <w:top w:val="single" w:color="BFBFBF" w:sz="4"/>
               <w:left w:val="single" w:color="BFBFBF" w:sz="4"/>
@@ -4494,9 +5281,11 @@
               <w:bottom w:type="dxa" w:w="60"/>
               <w:right w:type="dxa" w:w="100"/>
             </w:tcMar>
-          </w:tcPr>
-          <w:p>
-            <w:pPr>
+            <w:vAlign w:val="center"/>
+          </w:tcPr>
+          <w:p>
+            <w:pPr>
+              <w:keepNext/>
               <w:spacing w:after="0" w:before="0"/>
               <w:jc w:val="left"/>
             </w:pPr>
@@ -4515,26 +5304,29 @@
       </w:tr>
       <w:tr>
         <w:trPr>
+          <w:cantSplit/>
           <w:tblHeader w:val="false"/>
         </w:trPr>
         <w:tc>
           <w:tcPr>
-            <w:tcW w:type="dxa" w:w="5115"/>
-            <w:tcBorders>
-              <w:top w:val="single" w:color="BFBFBF" w:sz="4"/>
-              <w:left w:val="single" w:color="BFBFBF" w:sz="4"/>
-              <w:bottom w:val="single" w:color="BFBFBF" w:sz="4"/>
-              <w:right w:val="single" w:color="BFBFBF" w:sz="4"/>
-            </w:tcBorders>
-            <w:tcMar>
-              <w:top w:type="dxa" w:w="60"/>
-              <w:left w:type="dxa" w:w="100"/>
-              <w:bottom w:type="dxa" w:w="60"/>
-              <w:right w:type="dxa" w:w="100"/>
-            </w:tcMar>
-          </w:tcPr>
-          <w:p>
-            <w:pPr>
+            <w:tcW w:type="dxa" w:w="4560"/>
+            <w:tcBorders>
+              <w:top w:val="single" w:color="BFBFBF" w:sz="4"/>
+              <w:left w:val="single" w:color="BFBFBF" w:sz="4"/>
+              <w:bottom w:val="single" w:color="BFBFBF" w:sz="4"/>
+              <w:right w:val="single" w:color="BFBFBF" w:sz="4"/>
+            </w:tcBorders>
+            <w:tcMar>
+              <w:top w:type="dxa" w:w="60"/>
+              <w:left w:type="dxa" w:w="100"/>
+              <w:bottom w:type="dxa" w:w="60"/>
+              <w:right w:type="dxa" w:w="100"/>
+            </w:tcMar>
+            <w:vAlign w:val="center"/>
+          </w:tcPr>
+          <w:p>
+            <w:pPr>
+              <w:keepNext/>
               <w:spacing w:after="0" w:before="0"/>
               <w:jc w:val="left"/>
             </w:pPr>
@@ -4549,24 +5341,26 @@
         </w:tc>
         <w:tc>
           <w:tcPr>
-            <w:tcW w:type="dxa" w:w="2830"/>
-            <w:tcBorders>
-              <w:top w:val="single" w:color="BFBFBF" w:sz="4"/>
-              <w:left w:val="single" w:color="BFBFBF" w:sz="4"/>
-              <w:bottom w:val="single" w:color="BFBFBF" w:sz="4"/>
-              <w:right w:val="single" w:color="BFBFBF" w:sz="4"/>
-            </w:tcBorders>
-            <w:tcMar>
-              <w:top w:type="dxa" w:w="60"/>
-              <w:left w:type="dxa" w:w="100"/>
-              <w:bottom w:type="dxa" w:w="60"/>
-              <w:right w:type="dxa" w:w="100"/>
-            </w:tcMar>
-          </w:tcPr>
-          <w:p>
-            <w:pPr>
-              <w:spacing w:after="0" w:before="0"/>
-              <w:jc w:val="right"/>
+            <w:tcW w:type="dxa" w:w="2600"/>
+            <w:tcBorders>
+              <w:top w:val="single" w:color="BFBFBF" w:sz="4"/>
+              <w:left w:val="single" w:color="BFBFBF" w:sz="4"/>
+              <w:bottom w:val="single" w:color="BFBFBF" w:sz="4"/>
+              <w:right w:val="single" w:color="BFBFBF" w:sz="4"/>
+            </w:tcBorders>
+            <w:tcMar>
+              <w:top w:type="dxa" w:w="60"/>
+              <w:left w:type="dxa" w:w="100"/>
+              <w:bottom w:type="dxa" w:w="60"/>
+              <w:right w:type="dxa" w:w="100"/>
+            </w:tcMar>
+            <w:vAlign w:val="center"/>
+          </w:tcPr>
+          <w:p>
+            <w:pPr>
+              <w:keepNext/>
+              <w:spacing w:after="0" w:before="0"/>
+              <w:jc w:val="center"/>
             </w:pPr>
             <w:r>
               <w:rPr>
@@ -4581,24 +5375,26 @@
         </w:tc>
         <w:tc>
           <w:tcPr>
-            <w:tcW w:type="dxa" w:w="1415"/>
-            <w:tcBorders>
-              <w:top w:val="single" w:color="BFBFBF" w:sz="4"/>
-              <w:left w:val="single" w:color="BFBFBF" w:sz="4"/>
-              <w:bottom w:val="single" w:color="BFBFBF" w:sz="4"/>
-              <w:right w:val="single" w:color="BFBFBF" w:sz="4"/>
-            </w:tcBorders>
-            <w:tcMar>
-              <w:top w:type="dxa" w:w="60"/>
-              <w:left w:type="dxa" w:w="100"/>
-              <w:bottom w:type="dxa" w:w="60"/>
-              <w:right w:type="dxa" w:w="100"/>
-            </w:tcMar>
-          </w:tcPr>
-          <w:p>
-            <w:pPr>
-              <w:spacing w:after="0" w:before="0"/>
-              <w:jc w:val="right"/>
+            <w:tcW w:type="dxa" w:w="2200"/>
+            <w:tcBorders>
+              <w:top w:val="single" w:color="BFBFBF" w:sz="4"/>
+              <w:left w:val="single" w:color="BFBFBF" w:sz="4"/>
+              <w:bottom w:val="single" w:color="BFBFBF" w:sz="4"/>
+              <w:right w:val="single" w:color="BFBFBF" w:sz="4"/>
+            </w:tcBorders>
+            <w:tcMar>
+              <w:top w:type="dxa" w:w="60"/>
+              <w:left w:type="dxa" w:w="100"/>
+              <w:bottom w:type="dxa" w:w="60"/>
+              <w:right w:type="dxa" w:w="100"/>
+            </w:tcMar>
+            <w:vAlign w:val="center"/>
+          </w:tcPr>
+          <w:p>
+            <w:pPr>
+              <w:keepNext/>
+              <w:spacing w:after="0" w:before="0"/>
+              <w:jc w:val="center"/>
             </w:pPr>
             <w:r>
               <w:rPr>
@@ -4612,11 +5408,12 @@
       </w:tr>
       <w:tr>
         <w:trPr>
+          <w:cantSplit/>
           <w:tblHeader w:val="false"/>
         </w:trPr>
         <w:tc>
           <w:tcPr>
-            <w:tcW w:type="dxa" w:w="5115"/>
+            <w:tcW w:type="dxa" w:w="4560"/>
             <w:tcBorders>
               <w:top w:val="single" w:color="BFBFBF" w:sz="4"/>
               <w:left w:val="single" w:color="BFBFBF" w:sz="4"/>
@@ -4630,9 +5427,11 @@
               <w:bottom w:type="dxa" w:w="60"/>
               <w:right w:type="dxa" w:w="100"/>
             </w:tcMar>
-          </w:tcPr>
-          <w:p>
-            <w:pPr>
+            <w:vAlign w:val="center"/>
+          </w:tcPr>
+          <w:p>
+            <w:pPr>
+              <w:keepNext/>
               <w:spacing w:after="0" w:before="0"/>
               <w:jc w:val="left"/>
             </w:pPr>
@@ -4647,7 +5446,7 @@
         </w:tc>
         <w:tc>
           <w:tcPr>
-            <w:tcW w:type="dxa" w:w="2830"/>
+            <w:tcW w:type="dxa" w:w="2600"/>
             <w:tcBorders>
               <w:top w:val="single" w:color="BFBFBF" w:sz="4"/>
               <w:left w:val="single" w:color="BFBFBF" w:sz="4"/>
@@ -4661,11 +5460,13 @@
               <w:bottom w:type="dxa" w:w="60"/>
               <w:right w:type="dxa" w:w="100"/>
             </w:tcMar>
-          </w:tcPr>
-          <w:p>
-            <w:pPr>
-              <w:spacing w:after="0" w:before="0"/>
-              <w:jc w:val="right"/>
+            <w:vAlign w:val="center"/>
+          </w:tcPr>
+          <w:p>
+            <w:pPr>
+              <w:keepNext/>
+              <w:spacing w:after="0" w:before="0"/>
+              <w:jc w:val="center"/>
             </w:pPr>
             <w:r>
               <w:rPr>
@@ -4680,7 +5481,7 @@
         </w:tc>
         <w:tc>
           <w:tcPr>
-            <w:tcW w:type="dxa" w:w="1415"/>
+            <w:tcW w:type="dxa" w:w="2200"/>
             <w:tcBorders>
               <w:top w:val="single" w:color="BFBFBF" w:sz="4"/>
               <w:left w:val="single" w:color="BFBFBF" w:sz="4"/>
@@ -4694,11 +5495,13 @@
               <w:bottom w:type="dxa" w:w="60"/>
               <w:right w:type="dxa" w:w="100"/>
             </w:tcMar>
-          </w:tcPr>
-          <w:p>
-            <w:pPr>
-              <w:spacing w:after="0" w:before="0"/>
-              <w:jc w:val="right"/>
+            <w:vAlign w:val="center"/>
+          </w:tcPr>
+          <w:p>
+            <w:pPr>
+              <w:keepNext/>
+              <w:spacing w:after="0" w:before="0"/>
+              <w:jc w:val="center"/>
             </w:pPr>
             <w:r>
               <w:rPr>
@@ -4712,26 +5515,29 @@
       </w:tr>
       <w:tr>
         <w:trPr>
+          <w:cantSplit/>
           <w:tblHeader w:val="false"/>
         </w:trPr>
         <w:tc>
           <w:tcPr>
-            <w:tcW w:type="dxa" w:w="5115"/>
-            <w:tcBorders>
-              <w:top w:val="single" w:color="BFBFBF" w:sz="4"/>
-              <w:left w:val="single" w:color="BFBFBF" w:sz="4"/>
-              <w:bottom w:val="single" w:color="BFBFBF" w:sz="4"/>
-              <w:right w:val="single" w:color="BFBFBF" w:sz="4"/>
-            </w:tcBorders>
-            <w:tcMar>
-              <w:top w:type="dxa" w:w="60"/>
-              <w:left w:type="dxa" w:w="100"/>
-              <w:bottom w:type="dxa" w:w="60"/>
-              <w:right w:type="dxa" w:w="100"/>
-            </w:tcMar>
-          </w:tcPr>
-          <w:p>
-            <w:pPr>
+            <w:tcW w:type="dxa" w:w="4560"/>
+            <w:tcBorders>
+              <w:top w:val="single" w:color="BFBFBF" w:sz="4"/>
+              <w:left w:val="single" w:color="BFBFBF" w:sz="4"/>
+              <w:bottom w:val="single" w:color="BFBFBF" w:sz="4"/>
+              <w:right w:val="single" w:color="BFBFBF" w:sz="4"/>
+            </w:tcBorders>
+            <w:tcMar>
+              <w:top w:type="dxa" w:w="60"/>
+              <w:left w:type="dxa" w:w="100"/>
+              <w:bottom w:type="dxa" w:w="60"/>
+              <w:right w:type="dxa" w:w="100"/>
+            </w:tcMar>
+            <w:vAlign w:val="center"/>
+          </w:tcPr>
+          <w:p>
+            <w:pPr>
+              <w:keepNext w:val="false"/>
               <w:spacing w:after="0" w:before="0"/>
               <w:jc w:val="left"/>
             </w:pPr>
@@ -4746,24 +5552,26 @@
         </w:tc>
         <w:tc>
           <w:tcPr>
-            <w:tcW w:type="dxa" w:w="2830"/>
-            <w:tcBorders>
-              <w:top w:val="single" w:color="BFBFBF" w:sz="4"/>
-              <w:left w:val="single" w:color="BFBFBF" w:sz="4"/>
-              <w:bottom w:val="single" w:color="BFBFBF" w:sz="4"/>
-              <w:right w:val="single" w:color="BFBFBF" w:sz="4"/>
-            </w:tcBorders>
-            <w:tcMar>
-              <w:top w:type="dxa" w:w="60"/>
-              <w:left w:type="dxa" w:w="100"/>
-              <w:bottom w:type="dxa" w:w="60"/>
-              <w:right w:type="dxa" w:w="100"/>
-            </w:tcMar>
-          </w:tcPr>
-          <w:p>
-            <w:pPr>
-              <w:spacing w:after="0" w:before="0"/>
-              <w:jc w:val="right"/>
+            <w:tcW w:type="dxa" w:w="2600"/>
+            <w:tcBorders>
+              <w:top w:val="single" w:color="BFBFBF" w:sz="4"/>
+              <w:left w:val="single" w:color="BFBFBF" w:sz="4"/>
+              <w:bottom w:val="single" w:color="BFBFBF" w:sz="4"/>
+              <w:right w:val="single" w:color="BFBFBF" w:sz="4"/>
+            </w:tcBorders>
+            <w:tcMar>
+              <w:top w:type="dxa" w:w="60"/>
+              <w:left w:type="dxa" w:w="100"/>
+              <w:bottom w:type="dxa" w:w="60"/>
+              <w:right w:type="dxa" w:w="100"/>
+            </w:tcMar>
+            <w:vAlign w:val="center"/>
+          </w:tcPr>
+          <w:p>
+            <w:pPr>
+              <w:keepNext w:val="false"/>
+              <w:spacing w:after="0" w:before="0"/>
+              <w:jc w:val="center"/>
             </w:pPr>
             <w:r>
               <w:rPr>
@@ -4776,24 +5584,26 @@
         </w:tc>
         <w:tc>
           <w:tcPr>
-            <w:tcW w:type="dxa" w:w="1415"/>
-            <w:tcBorders>
-              <w:top w:val="single" w:color="BFBFBF" w:sz="4"/>
-              <w:left w:val="single" w:color="BFBFBF" w:sz="4"/>
-              <w:bottom w:val="single" w:color="BFBFBF" w:sz="4"/>
-              <w:right w:val="single" w:color="BFBFBF" w:sz="4"/>
-            </w:tcBorders>
-            <w:tcMar>
-              <w:top w:type="dxa" w:w="60"/>
-              <w:left w:type="dxa" w:w="100"/>
-              <w:bottom w:type="dxa" w:w="60"/>
-              <w:right w:type="dxa" w:w="100"/>
-            </w:tcMar>
-          </w:tcPr>
-          <w:p>
-            <w:pPr>
-              <w:spacing w:after="0" w:before="0"/>
-              <w:jc w:val="left"/>
+            <w:tcW w:type="dxa" w:w="2200"/>
+            <w:tcBorders>
+              <w:top w:val="single" w:color="BFBFBF" w:sz="4"/>
+              <w:left w:val="single" w:color="BFBFBF" w:sz="4"/>
+              <w:bottom w:val="single" w:color="BFBFBF" w:sz="4"/>
+              <w:right w:val="single" w:color="BFBFBF" w:sz="4"/>
+            </w:tcBorders>
+            <w:tcMar>
+              <w:top w:type="dxa" w:w="60"/>
+              <w:left w:type="dxa" w:w="100"/>
+              <w:bottom w:type="dxa" w:w="60"/>
+              <w:right w:type="dxa" w:w="100"/>
+            </w:tcMar>
+            <w:vAlign w:val="center"/>
+          </w:tcPr>
+          <w:p>
+            <w:pPr>
+              <w:keepNext w:val="false"/>
+              <w:spacing w:after="0" w:before="0"/>
+              <w:jc w:val="center"/>
             </w:pPr>
             <w:r>
               <w:rPr>
@@ -5076,7 +5886,7 @@
       <w:r>
         <w:t xml:space="preserve"> </w:t>
       </w:r>
-      <w:hyperlink w:history="1" r:id="rIde-d4hgo_2c495w2k0rrxx">
+      <w:hyperlink w:history="1" r:id="rIdnslvguqvchdismkrfbixa">
         <w:r>
           <w:rPr>
             <w:rStyle w:val="Hyperlink"/>
@@ -5107,7 +5917,7 @@
       <w:r>
         <w:t xml:space="preserve"> </w:t>
       </w:r>
-      <w:hyperlink w:history="1" r:id="rIdjw-_686odrosyumze4t_b">
+      <w:hyperlink w:history="1" r:id="rIdqqtfgry7budavlzm7n5d2">
         <w:r>
           <w:rPr>
             <w:rStyle w:val="Hyperlink"/>
@@ -5138,7 +5948,7 @@
       <w:r>
         <w:t xml:space="preserve"> (sample of TLC March 2019 records). </w:t>
       </w:r>
-      <w:hyperlink w:history="1" r:id="rIdfumq_6_kyjz7-wqbv5a6r">
+      <w:hyperlink w:history="1" r:id="rIdnqgedwy9vdtkef2tkgi5g">
         <w:r>
           <w:rPr>
             <w:rStyle w:val="Hyperlink"/>
@@ -5218,6 +6028,7 @@
       <w:pgSz w:w="12240" w:h="15840" w:orient="portrait"/>
       <w:pgMar w:top="1440" w:right="1440" w:bottom="1440" w:left="1440" w:header="708" w:footer="708" w:gutter="0"/>
       <w:pgNumType/>
+      <w:titlePg/>
       <w:docGrid w:linePitch="360"/>
     </w:sectPr>
   </w:body>
@@ -5456,7 +6267,7 @@
     </w:rPrDefault>
     <w:pPrDefault>
       <w:pPr>
-        <w:spacing w:line="276"/>
+        <w:spacing w:line="276" w:lineRule="auto"/>
       </w:pPr>
     </w:pPrDefault>
   </w:docDefaults>

</xml_diff>